<commit_message>
chore: sync 2026-05-11 23:49:08 UTC
</commit_message>
<xml_diff>
--- a/resumes/IT_Networking_resume.docx
+++ b/resumes/IT_Networking_resume.docx
@@ -24,7 +24,7 @@
           <w:sz w:val="28"/>
           <w:szCs w:val="28"/>
         </w:rPr>
-        <w:t>David Park Omer</w:t>
+        <w:t>David Omer</w:t>
       </w:r>
     </w:p>
     <w:p>
@@ -59,7 +59,7 @@
             <w:sz w:val="20"/>
             <w:szCs w:val="20"/>
           </w:rPr>
-          <w:t>david_1428@outlook.com</w:t>
+          <w:t>capture456@outlook.com</w:t>
         </w:r>
       </w:hyperlink>
       <w:r>
@@ -131,7 +131,27 @@
           <w:sz w:val="24"/>
           <w:szCs w:val="24"/>
         </w:rPr>
-        <w:t>IT and systems professional with 20+ years of experience supporting enterprise applications, network infrastructure, and data platforms across distributed environments.</w:t>
+        <w:t xml:space="preserve">IT and systems professional with 20+ years of experience supporting enterprise applications, </w:t>
+      </w:r>
+      <w:r>
+        <w:rPr>
+          <w:rFonts w:ascii="Aptos Display" w:hAnsi="Aptos Display" w:cs="Times New Roman"/>
+          <w:bCs/>
+          <w:w w:val="105"/>
+          <w:sz w:val="24"/>
+          <w:szCs w:val="24"/>
+        </w:rPr>
+        <w:t>IT infrastructure</w:t>
+      </w:r>
+      <w:r>
+        <w:rPr>
+          <w:rFonts w:ascii="Aptos Display" w:hAnsi="Aptos Display" w:cs="Times New Roman"/>
+          <w:bCs/>
+          <w:w w:val="105"/>
+          <w:sz w:val="24"/>
+          <w:szCs w:val="24"/>
+        </w:rPr>
+        <w:t>, and data platforms across distributed environments.</w:t>
       </w:r>
     </w:p>
     <w:p>
@@ -154,7 +174,27 @@
           <w:sz w:val="24"/>
           <w:szCs w:val="24"/>
         </w:rPr>
-        <w:t>Skilled in troubleshooting system and network issues, configuring and maintaining servers, and supporting hardware/software environments to ensure reliable performance.</w:t>
+        <w:t xml:space="preserve">Skilled in troubleshooting system and network issues, configuring and maintaining servers, and supporting </w:t>
+      </w:r>
+      <w:r>
+        <w:rPr>
+          <w:rFonts w:ascii="Aptos Display" w:hAnsi="Aptos Display" w:cs="Times New Roman"/>
+          <w:bCs/>
+          <w:w w:val="105"/>
+          <w:sz w:val="24"/>
+          <w:szCs w:val="24"/>
+        </w:rPr>
+        <w:t>hardware and software environments</w:t>
+      </w:r>
+      <w:r>
+        <w:rPr>
+          <w:rFonts w:ascii="Aptos Display" w:hAnsi="Aptos Display" w:cs="Times New Roman"/>
+          <w:bCs/>
+          <w:w w:val="105"/>
+          <w:sz w:val="24"/>
+          <w:szCs w:val="24"/>
+        </w:rPr>
+        <w:t xml:space="preserve"> to ensure reliable performance.</w:t>
       </w:r>
     </w:p>
     <w:p>
@@ -528,6 +568,28 @@
           <w:szCs w:val="26"/>
         </w:rPr>
         <w:t>Consultant</w:t>
+      </w:r>
+    </w:p>
+    <w:p>
+      <w:pPr>
+        <w:ind w:left="331"/>
+        <w:rPr>
+          <w:rFonts w:ascii="Aptos Display" w:hAnsi="Aptos Display"/>
+          <w:spacing w:val="-4"/>
+          <w:w w:val="105"/>
+          <w:sz w:val="26"/>
+          <w:szCs w:val="26"/>
+        </w:rPr>
+      </w:pPr>
+      <w:r>
+        <w:rPr>
+          <w:rFonts w:ascii="Aptos Display" w:hAnsi="Aptos Display"/>
+          <w:spacing w:val="-4"/>
+          <w:w w:val="105"/>
+          <w:sz w:val="26"/>
+          <w:szCs w:val="26"/>
+        </w:rPr>
+        <w:t>Industry / Client Focus: Small business platforms, automation, database-backed applications</w:t>
       </w:r>
     </w:p>
     <w:p>
@@ -676,6 +738,9 @@
     </w:p>
     <w:p>
       <w:pPr>
+        <w:keepNext/>
+        <w:keepLines/>
+        <w:widowControl/>
         <w:spacing w:before="106"/>
         <w:ind w:left="360"/>
         <w:rPr>
@@ -696,7 +761,63 @@
           <w:sz w:val="26"/>
           <w:szCs w:val="26"/>
         </w:rPr>
+        <w:lastRenderedPageBreak/>
         <w:t>Project Consulting Services, Inc. (via TEKsystems) — Senior Consultant</w:t>
+      </w:r>
+    </w:p>
+    <w:p>
+      <w:pPr>
+        <w:keepNext/>
+        <w:keepLines/>
+        <w:widowControl/>
+        <w:ind w:left="331"/>
+        <w:rPr>
+          <w:rFonts w:ascii="Aptos Display" w:hAnsi="Aptos Display"/>
+          <w:spacing w:val="-4"/>
+          <w:w w:val="105"/>
+          <w:sz w:val="26"/>
+          <w:szCs w:val="26"/>
+        </w:rPr>
+      </w:pPr>
+      <w:r>
+        <w:rPr>
+          <w:rFonts w:ascii="Aptos Display" w:hAnsi="Aptos Display"/>
+          <w:spacing w:val="-4"/>
+          <w:w w:val="105"/>
+          <w:sz w:val="26"/>
+          <w:szCs w:val="26"/>
+        </w:rPr>
+        <w:t xml:space="preserve">Industry / Client Focus: </w:t>
+      </w:r>
+      <w:r>
+        <w:rPr>
+          <w:rFonts w:ascii="Aptos Display" w:hAnsi="Aptos Display"/>
+          <w:spacing w:val="-4"/>
+          <w:w w:val="105"/>
+          <w:sz w:val="26"/>
+          <w:szCs w:val="26"/>
+        </w:rPr>
+        <w:t>Oil &amp; Gas, p</w:t>
+      </w:r>
+      <w:r>
+        <w:rPr>
+          <w:rFonts w:ascii="Aptos Display" w:hAnsi="Aptos Display" w:cs="Times New Roman"/>
+          <w:spacing w:val="-4"/>
+          <w:w w:val="105"/>
+          <w:sz w:val="26"/>
+          <w:szCs w:val="26"/>
+        </w:rPr>
+        <w:t>rovides professional services for energy infrastruct</w:t>
+      </w:r>
+      <w:r>
+        <w:rPr>
+          <w:rFonts w:ascii="Aptos Display" w:hAnsi="Aptos Display"/>
+          <w:spacing w:val="-4"/>
+          <w:w w:val="105"/>
+          <w:sz w:val="26"/>
+          <w:szCs w:val="26"/>
+        </w:rPr>
+        <w:t>ure</w:t>
       </w:r>
     </w:p>
     <w:p>
@@ -745,977 +866,6 @@
           <w:szCs w:val="24"/>
         </w:rPr>
         <w:t>2024</w:t>
-      </w:r>
-    </w:p>
-    <w:p>
-      <w:pPr>
-        <w:pStyle w:val="ListParagraph"/>
-        <w:widowControl/>
-        <w:numPr>
-          <w:ilvl w:val="0"/>
-          <w:numId w:val="27"/>
-        </w:numPr>
-        <w:autoSpaceDE/>
-        <w:autoSpaceDN/>
-        <w:ind w:right="680"/>
-        <w:rPr>
-          <w:rFonts w:ascii="Aptos Display" w:eastAsia="Times New Roman" w:hAnsi="Aptos Display" w:cs="Times New Roman"/>
-          <w:sz w:val="24"/>
-          <w:szCs w:val="24"/>
-        </w:rPr>
-      </w:pPr>
-      <w:r>
-        <w:rPr>
-          <w:rFonts w:ascii="Aptos Display" w:eastAsia="Times New Roman" w:hAnsi="Aptos Display" w:cs="Times New Roman"/>
-          <w:sz w:val="24"/>
-          <w:szCs w:val="24"/>
-        </w:rPr>
-        <w:t>Troubleshot and resolved production issues across distributed systems, including database, middleware, and network-related failures</w:t>
-      </w:r>
-    </w:p>
-    <w:p>
-      <w:pPr>
-        <w:pStyle w:val="ListParagraph"/>
-        <w:widowControl/>
-        <w:numPr>
-          <w:ilvl w:val="0"/>
-          <w:numId w:val="27"/>
-        </w:numPr>
-        <w:autoSpaceDE/>
-        <w:autoSpaceDN/>
-        <w:ind w:right="680"/>
-        <w:rPr>
-          <w:rFonts w:ascii="Aptos Display" w:eastAsia="Times New Roman" w:hAnsi="Aptos Display" w:cs="Times New Roman"/>
-          <w:sz w:val="24"/>
-          <w:szCs w:val="24"/>
-        </w:rPr>
-      </w:pPr>
-      <w:r>
-        <w:rPr>
-          <w:rFonts w:ascii="Aptos Display" w:eastAsia="Times New Roman" w:hAnsi="Aptos Display" w:cs="Times New Roman"/>
-          <w:sz w:val="24"/>
-          <w:szCs w:val="24"/>
-        </w:rPr>
-        <w:t>Supported enterprise data platforms and integration systems, ensuring reliable system performance and uptime</w:t>
-      </w:r>
-    </w:p>
-    <w:p>
-      <w:pPr>
-        <w:pStyle w:val="ListParagraph"/>
-        <w:widowControl/>
-        <w:numPr>
-          <w:ilvl w:val="0"/>
-          <w:numId w:val="27"/>
-        </w:numPr>
-        <w:autoSpaceDE/>
-        <w:autoSpaceDN/>
-        <w:ind w:right="680"/>
-        <w:rPr>
-          <w:rFonts w:ascii="Aptos Display" w:eastAsia="Times New Roman" w:hAnsi="Aptos Display" w:cs="Times New Roman"/>
-          <w:sz w:val="24"/>
-          <w:szCs w:val="24"/>
-        </w:rPr>
-      </w:pPr>
-      <w:r>
-        <w:rPr>
-          <w:rFonts w:ascii="Aptos Display" w:eastAsia="Times New Roman" w:hAnsi="Aptos Display" w:cs="Times New Roman"/>
-          <w:sz w:val="24"/>
-          <w:szCs w:val="24"/>
-        </w:rPr>
-        <w:lastRenderedPageBreak/>
-        <w:t>Diagnosed performance bottlenecks and system slowdowns, improving responsiveness and stability</w:t>
-      </w:r>
-    </w:p>
-    <w:p>
-      <w:pPr>
-        <w:pStyle w:val="ListParagraph"/>
-        <w:widowControl/>
-        <w:numPr>
-          <w:ilvl w:val="0"/>
-          <w:numId w:val="27"/>
-        </w:numPr>
-        <w:autoSpaceDE/>
-        <w:autoSpaceDN/>
-        <w:ind w:right="680"/>
-        <w:rPr>
-          <w:rFonts w:ascii="Aptos Display" w:eastAsia="Times New Roman" w:hAnsi="Aptos Display" w:cs="Times New Roman"/>
-          <w:sz w:val="24"/>
-          <w:szCs w:val="24"/>
-        </w:rPr>
-      </w:pPr>
-      <w:r>
-        <w:rPr>
-          <w:rFonts w:ascii="Aptos Display" w:eastAsia="Times New Roman" w:hAnsi="Aptos Display" w:cs="Times New Roman"/>
-          <w:sz w:val="24"/>
-          <w:szCs w:val="24"/>
-        </w:rPr>
-        <w:t>Collaborated with infrastructure and development teams to resolve system-level issues impacting application performance</w:t>
-      </w:r>
-    </w:p>
-    <w:p>
-      <w:pPr>
-        <w:numPr>
-          <w:ilvl w:val="0"/>
-          <w:numId w:val="26"/>
-        </w:numPr>
-        <w:spacing w:after="160"/>
-        <w:rPr>
-          <w:rFonts w:ascii="Aptos Display" w:hAnsi="Aptos Display" w:cs="Times New Roman"/>
-          <w:bCs/>
-          <w:w w:val="105"/>
-          <w:sz w:val="24"/>
-          <w:szCs w:val="24"/>
-        </w:rPr>
-      </w:pPr>
-      <w:r>
-        <w:rPr>
-          <w:rFonts w:ascii="Aptos Display" w:hAnsi="Aptos Display" w:cs="Times New Roman"/>
-          <w:bCs/>
-          <w:w w:val="105"/>
-          <w:sz w:val="24"/>
-          <w:szCs w:val="24"/>
-        </w:rPr>
-        <w:t>Worked with cloud-hosted environments (Azure SQL and related services) to maintain system reliability</w:t>
-      </w:r>
-    </w:p>
-    <w:p>
-      <w:pPr>
-        <w:spacing w:before="106"/>
-        <w:ind w:left="360"/>
-        <w:rPr>
-          <w:rFonts w:ascii="Aptos Display" w:hAnsi="Aptos Display"/>
-          <w:b/>
-          <w:bCs/>
-          <w:w w:val="105"/>
-          <w:sz w:val="26"/>
-          <w:szCs w:val="26"/>
-        </w:rPr>
-      </w:pPr>
-      <w:r>
-        <w:rPr>
-          <w:rFonts w:ascii="Aptos Display" w:hAnsi="Aptos Display"/>
-          <w:b/>
-          <w:bCs/>
-          <w:w w:val="105"/>
-          <w:sz w:val="26"/>
-          <w:szCs w:val="26"/>
-        </w:rPr>
-        <w:t>Independent Consultant</w:t>
-      </w:r>
-    </w:p>
-    <w:p>
-      <w:pPr>
-        <w:keepNext/>
-        <w:keepLines/>
-        <w:widowControl/>
-        <w:autoSpaceDE/>
-        <w:autoSpaceDN/>
-        <w:spacing w:after="160"/>
-        <w:ind w:left="330" w:right="680"/>
-        <w:rPr>
-          <w:rFonts w:ascii="Aptos Display" w:eastAsia="Times New Roman" w:hAnsi="Aptos Display" w:cs="Times New Roman"/>
-          <w:sz w:val="24"/>
-          <w:szCs w:val="24"/>
-        </w:rPr>
-      </w:pPr>
-      <w:r>
-        <w:rPr>
-          <w:rFonts w:ascii="Aptos Display" w:eastAsia="Times New Roman" w:hAnsi="Aptos Display" w:cs="Times New Roman"/>
-          <w:sz w:val="24"/>
-          <w:szCs w:val="24"/>
-        </w:rPr>
-        <w:t>03/2014 – 08/2015</w:t>
-      </w:r>
-    </w:p>
-    <w:p>
-      <w:pPr>
-        <w:pStyle w:val="ListParagraph"/>
-        <w:widowControl/>
-        <w:numPr>
-          <w:ilvl w:val="0"/>
-          <w:numId w:val="27"/>
-        </w:numPr>
-        <w:autoSpaceDE/>
-        <w:autoSpaceDN/>
-        <w:ind w:right="680"/>
-        <w:rPr>
-          <w:rFonts w:ascii="Aptos Display" w:eastAsia="Times New Roman" w:hAnsi="Aptos Display" w:cs="Times New Roman"/>
-          <w:sz w:val="24"/>
-          <w:szCs w:val="24"/>
-        </w:rPr>
-      </w:pPr>
-      <w:r>
-        <w:rPr>
-          <w:rFonts w:ascii="Aptos Display" w:eastAsia="Times New Roman" w:hAnsi="Aptos Display" w:cs="Times New Roman"/>
-          <w:sz w:val="24"/>
-          <w:szCs w:val="24"/>
-        </w:rPr>
-        <w:t>Delivered custom .NET/MVC and browser-based applications using HTML5, CSS3, JavaScript, and SQL-backed application patterns.</w:t>
-      </w:r>
-    </w:p>
-    <w:p>
-      <w:pPr>
-        <w:pStyle w:val="ListParagraph"/>
-        <w:widowControl/>
-        <w:numPr>
-          <w:ilvl w:val="0"/>
-          <w:numId w:val="27"/>
-        </w:numPr>
-        <w:autoSpaceDE/>
-        <w:autoSpaceDN/>
-        <w:ind w:right="680"/>
-        <w:rPr>
-          <w:rFonts w:ascii="Aptos Display" w:eastAsia="Times New Roman" w:hAnsi="Aptos Display" w:cs="Times New Roman"/>
-          <w:sz w:val="24"/>
-          <w:szCs w:val="24"/>
-        </w:rPr>
-      </w:pPr>
-      <w:r>
-        <w:rPr>
-          <w:rFonts w:ascii="Aptos Display" w:eastAsia="Times New Roman" w:hAnsi="Aptos Display" w:cs="Times New Roman"/>
-          <w:sz w:val="24"/>
-          <w:szCs w:val="24"/>
-        </w:rPr>
-        <w:t>Built responsive UI, database-driven workflows, reporting views, and analytics outputs for small business and enterprise use cases.</w:t>
-      </w:r>
-    </w:p>
-    <w:p>
-      <w:pPr>
-        <w:numPr>
-          <w:ilvl w:val="0"/>
-          <w:numId w:val="26"/>
-        </w:numPr>
-        <w:spacing w:after="160"/>
-        <w:rPr>
-          <w:rFonts w:ascii="Aptos Display" w:hAnsi="Aptos Display" w:cs="Times New Roman"/>
-          <w:bCs/>
-          <w:w w:val="105"/>
-          <w:sz w:val="24"/>
-          <w:szCs w:val="24"/>
-        </w:rPr>
-      </w:pPr>
-      <w:r>
-        <w:rPr>
-          <w:rFonts w:ascii="Aptos Display" w:hAnsi="Aptos Display" w:cs="Times New Roman"/>
-          <w:bCs/>
-          <w:w w:val="105"/>
-          <w:sz w:val="24"/>
-          <w:szCs w:val="24"/>
-        </w:rPr>
-        <w:t>Supported legacy modernization by integrating older systems with web applications, relational databases, APIs, and middleware-style data flows.</w:t>
-      </w:r>
-    </w:p>
-    <w:p>
-      <w:pPr>
-        <w:spacing w:before="106"/>
-        <w:ind w:left="360"/>
-        <w:rPr>
-          <w:rFonts w:ascii="Aptos Display" w:hAnsi="Aptos Display"/>
-          <w:b/>
-          <w:bCs/>
-          <w:w w:val="105"/>
-          <w:sz w:val="26"/>
-          <w:szCs w:val="26"/>
-        </w:rPr>
-      </w:pPr>
-      <w:r>
-        <w:rPr>
-          <w:rFonts w:ascii="Aptos Display" w:hAnsi="Aptos Display"/>
-          <w:b/>
-          <w:bCs/>
-          <w:w w:val="105"/>
-          <w:sz w:val="26"/>
-          <w:szCs w:val="26"/>
-        </w:rPr>
-        <w:t>Steton Technology Group — Lead Architect</w:t>
-      </w:r>
-    </w:p>
-    <w:p>
-      <w:pPr>
-        <w:keepNext/>
-        <w:keepLines/>
-        <w:widowControl/>
-        <w:autoSpaceDE/>
-        <w:autoSpaceDN/>
-        <w:spacing w:after="160"/>
-        <w:ind w:left="330" w:right="680"/>
-        <w:rPr>
-          <w:rFonts w:ascii="Aptos Display" w:eastAsia="Times New Roman" w:hAnsi="Aptos Display" w:cs="Times New Roman"/>
-          <w:sz w:val="24"/>
-          <w:szCs w:val="24"/>
-        </w:rPr>
-      </w:pPr>
-      <w:r>
-        <w:rPr>
-          <w:rFonts w:ascii="Aptos Display" w:eastAsia="Times New Roman" w:hAnsi="Aptos Display" w:cs="Times New Roman"/>
-          <w:sz w:val="24"/>
-          <w:szCs w:val="24"/>
-        </w:rPr>
-        <w:t>01/</w:t>
-      </w:r>
-      <w:r>
-        <w:rPr>
-          <w:rFonts w:ascii="Aptos Display" w:eastAsia="Times New Roman" w:hAnsi="Aptos Display" w:cs="Times New Roman"/>
-          <w:sz w:val="24"/>
-          <w:szCs w:val="24"/>
-        </w:rPr>
-        <w:t>200</w:t>
-      </w:r>
-      <w:r>
-        <w:rPr>
-          <w:rFonts w:ascii="Aptos Display" w:eastAsia="Times New Roman" w:hAnsi="Aptos Display" w:cs="Times New Roman"/>
-          <w:sz w:val="24"/>
-          <w:szCs w:val="24"/>
-        </w:rPr>
-        <w:t>4</w:t>
-      </w:r>
-      <w:r>
-        <w:rPr>
-          <w:rFonts w:ascii="Aptos Display" w:eastAsia="Times New Roman" w:hAnsi="Aptos Display" w:cs="Times New Roman"/>
-          <w:sz w:val="24"/>
-          <w:szCs w:val="24"/>
-        </w:rPr>
-        <w:t xml:space="preserve"> – </w:t>
-      </w:r>
-      <w:r>
-        <w:rPr>
-          <w:rFonts w:ascii="Aptos Display" w:eastAsia="Times New Roman" w:hAnsi="Aptos Display" w:cs="Times New Roman"/>
-          <w:sz w:val="24"/>
-          <w:szCs w:val="24"/>
-        </w:rPr>
-        <w:t>03/</w:t>
-      </w:r>
-      <w:r>
-        <w:rPr>
-          <w:rFonts w:ascii="Aptos Display" w:eastAsia="Times New Roman" w:hAnsi="Aptos Display" w:cs="Times New Roman"/>
-          <w:sz w:val="24"/>
-          <w:szCs w:val="24"/>
-        </w:rPr>
-        <w:t>201</w:t>
-      </w:r>
-      <w:r>
-        <w:rPr>
-          <w:rFonts w:ascii="Aptos Display" w:eastAsia="Times New Roman" w:hAnsi="Aptos Display" w:cs="Times New Roman"/>
-          <w:sz w:val="24"/>
-          <w:szCs w:val="24"/>
-        </w:rPr>
-        <w:t>4</w:t>
-      </w:r>
-    </w:p>
-    <w:p>
-      <w:pPr>
-        <w:pStyle w:val="ListParagraph"/>
-        <w:widowControl/>
-        <w:numPr>
-          <w:ilvl w:val="0"/>
-          <w:numId w:val="27"/>
-        </w:numPr>
-        <w:autoSpaceDE/>
-        <w:autoSpaceDN/>
-        <w:ind w:right="680"/>
-        <w:rPr>
-          <w:rFonts w:ascii="Aptos Display" w:eastAsia="Times New Roman" w:hAnsi="Aptos Display" w:cs="Times New Roman"/>
-          <w:sz w:val="24"/>
-          <w:szCs w:val="24"/>
-        </w:rPr>
-      </w:pPr>
-      <w:r>
-        <w:rPr>
-          <w:rFonts w:ascii="Aptos Display" w:eastAsia="Times New Roman" w:hAnsi="Aptos Display" w:cs="Times New Roman"/>
-          <w:sz w:val="24"/>
-          <w:szCs w:val="24"/>
-        </w:rPr>
-        <w:t>Led operation and support of a multi-tenant SaaS platform, including system monitoring, issue resolution, and performance tuning</w:t>
-      </w:r>
-    </w:p>
-    <w:p>
-      <w:pPr>
-        <w:pStyle w:val="ListParagraph"/>
-        <w:widowControl/>
-        <w:numPr>
-          <w:ilvl w:val="0"/>
-          <w:numId w:val="27"/>
-        </w:numPr>
-        <w:autoSpaceDE/>
-        <w:autoSpaceDN/>
-        <w:ind w:right="680"/>
-        <w:rPr>
-          <w:rFonts w:ascii="Aptos Display" w:eastAsia="Times New Roman" w:hAnsi="Aptos Display" w:cs="Times New Roman"/>
-          <w:sz w:val="24"/>
-          <w:szCs w:val="24"/>
-        </w:rPr>
-      </w:pPr>
-      <w:r>
-        <w:rPr>
-          <w:rFonts w:ascii="Aptos Display" w:eastAsia="Times New Roman" w:hAnsi="Aptos Display" w:cs="Times New Roman"/>
-          <w:sz w:val="24"/>
-          <w:szCs w:val="24"/>
-        </w:rPr>
-        <w:t>Maintained application and database infrastructure supporting thousands of users</w:t>
-      </w:r>
-    </w:p>
-    <w:p>
-      <w:pPr>
-        <w:pStyle w:val="ListParagraph"/>
-        <w:widowControl/>
-        <w:numPr>
-          <w:ilvl w:val="0"/>
-          <w:numId w:val="27"/>
-        </w:numPr>
-        <w:autoSpaceDE/>
-        <w:autoSpaceDN/>
-        <w:ind w:right="680"/>
-        <w:rPr>
-          <w:rFonts w:ascii="Aptos Display" w:eastAsia="Times New Roman" w:hAnsi="Aptos Display" w:cs="Times New Roman"/>
-          <w:sz w:val="24"/>
-          <w:szCs w:val="24"/>
-        </w:rPr>
-      </w:pPr>
-      <w:r>
-        <w:rPr>
-          <w:rFonts w:ascii="Aptos Display" w:eastAsia="Times New Roman" w:hAnsi="Aptos Display" w:cs="Times New Roman"/>
-          <w:sz w:val="24"/>
-          <w:szCs w:val="24"/>
-        </w:rPr>
-        <w:t>Implemented cloud-based infrastructure improvements to enhance system availability and reliability</w:t>
-      </w:r>
-    </w:p>
-    <w:p>
-      <w:pPr>
-        <w:numPr>
-          <w:ilvl w:val="0"/>
-          <w:numId w:val="26"/>
-        </w:numPr>
-        <w:spacing w:after="160"/>
-        <w:rPr>
-          <w:rFonts w:ascii="Aptos Display" w:hAnsi="Aptos Display" w:cs="Times New Roman"/>
-          <w:bCs/>
-          <w:w w:val="105"/>
-          <w:sz w:val="24"/>
-          <w:szCs w:val="24"/>
-        </w:rPr>
-      </w:pPr>
-      <w:r>
-        <w:rPr>
-          <w:rFonts w:ascii="Aptos Display" w:hAnsi="Aptos Display" w:cs="Times New Roman"/>
-          <w:bCs/>
-          <w:w w:val="105"/>
-          <w:sz w:val="24"/>
-          <w:szCs w:val="24"/>
-        </w:rPr>
-        <w:t>Diagnosed and resolved production issues across application, database, and infrastructure layers</w:t>
-      </w:r>
-    </w:p>
-    <w:p>
-      <w:pPr>
-        <w:spacing w:before="106"/>
-        <w:ind w:left="360"/>
-        <w:rPr>
-          <w:rFonts w:ascii="Aptos Display" w:hAnsi="Aptos Display"/>
-          <w:b/>
-          <w:bCs/>
-          <w:w w:val="105"/>
-          <w:sz w:val="26"/>
-          <w:szCs w:val="26"/>
-        </w:rPr>
-      </w:pPr>
-      <w:r>
-        <w:rPr>
-          <w:rFonts w:ascii="Aptos Display" w:hAnsi="Aptos Display"/>
-          <w:b/>
-          <w:bCs/>
-          <w:w w:val="105"/>
-          <w:sz w:val="26"/>
-          <w:szCs w:val="26"/>
-        </w:rPr>
-        <w:t>SeeBeyond — Senior Consultant</w:t>
-      </w:r>
-    </w:p>
-    <w:p>
-      <w:pPr>
-        <w:keepNext/>
-        <w:keepLines/>
-        <w:widowControl/>
-        <w:autoSpaceDE/>
-        <w:autoSpaceDN/>
-        <w:spacing w:after="160"/>
-        <w:ind w:left="330" w:right="680"/>
-        <w:rPr>
-          <w:rFonts w:ascii="Aptos Display" w:eastAsia="Times New Roman" w:hAnsi="Aptos Display" w:cs="Times New Roman"/>
-          <w:sz w:val="24"/>
-          <w:szCs w:val="24"/>
-        </w:rPr>
-      </w:pPr>
-      <w:r>
-        <w:rPr>
-          <w:rFonts w:ascii="Aptos Display" w:eastAsia="Times New Roman" w:hAnsi="Aptos Display" w:cs="Times New Roman"/>
-          <w:sz w:val="24"/>
-          <w:szCs w:val="24"/>
-        </w:rPr>
-        <w:t>10/</w:t>
-      </w:r>
-      <w:r>
-        <w:rPr>
-          <w:rFonts w:ascii="Aptos Display" w:eastAsia="Times New Roman" w:hAnsi="Aptos Display" w:cs="Times New Roman"/>
-          <w:sz w:val="24"/>
-          <w:szCs w:val="24"/>
-        </w:rPr>
-        <w:t xml:space="preserve">2002 – </w:t>
-      </w:r>
-      <w:r>
-        <w:rPr>
-          <w:rFonts w:ascii="Aptos Display" w:eastAsia="Times New Roman" w:hAnsi="Aptos Display" w:cs="Times New Roman"/>
-          <w:sz w:val="24"/>
-          <w:szCs w:val="24"/>
-        </w:rPr>
-        <w:t>12/</w:t>
-      </w:r>
-      <w:r>
-        <w:rPr>
-          <w:rFonts w:ascii="Aptos Display" w:eastAsia="Times New Roman" w:hAnsi="Aptos Display" w:cs="Times New Roman"/>
-          <w:sz w:val="24"/>
-          <w:szCs w:val="24"/>
-        </w:rPr>
-        <w:t>200</w:t>
-      </w:r>
-      <w:r>
-        <w:rPr>
-          <w:rFonts w:ascii="Aptos Display" w:eastAsia="Times New Roman" w:hAnsi="Aptos Display" w:cs="Times New Roman"/>
-          <w:sz w:val="24"/>
-          <w:szCs w:val="24"/>
-        </w:rPr>
-        <w:t>3</w:t>
-      </w:r>
-    </w:p>
-    <w:p>
-      <w:pPr>
-        <w:pStyle w:val="ListParagraph"/>
-        <w:widowControl/>
-        <w:numPr>
-          <w:ilvl w:val="0"/>
-          <w:numId w:val="27"/>
-        </w:numPr>
-        <w:autoSpaceDE/>
-        <w:autoSpaceDN/>
-        <w:ind w:right="680"/>
-        <w:rPr>
-          <w:rFonts w:ascii="Aptos Display" w:eastAsia="Times New Roman" w:hAnsi="Aptos Display" w:cs="Times New Roman"/>
-          <w:sz w:val="24"/>
-          <w:szCs w:val="24"/>
-        </w:rPr>
-      </w:pPr>
-      <w:r>
-        <w:rPr>
-          <w:rFonts w:ascii="Aptos Display" w:eastAsia="Times New Roman" w:hAnsi="Aptos Display" w:cs="Times New Roman"/>
-          <w:sz w:val="24"/>
-          <w:szCs w:val="24"/>
-        </w:rPr>
-        <w:t>Supported enterprise integration environments, troubleshooting data flow and system communication issues</w:t>
-      </w:r>
-    </w:p>
-    <w:p>
-      <w:pPr>
-        <w:pStyle w:val="ListParagraph"/>
-        <w:widowControl/>
-        <w:numPr>
-          <w:ilvl w:val="0"/>
-          <w:numId w:val="27"/>
-        </w:numPr>
-        <w:autoSpaceDE/>
-        <w:autoSpaceDN/>
-        <w:ind w:right="680"/>
-        <w:rPr>
-          <w:rFonts w:ascii="Aptos Display" w:eastAsia="Times New Roman" w:hAnsi="Aptos Display" w:cs="Times New Roman"/>
-          <w:sz w:val="24"/>
-          <w:szCs w:val="24"/>
-        </w:rPr>
-      </w:pPr>
-      <w:r>
-        <w:rPr>
-          <w:rFonts w:ascii="Aptos Display" w:eastAsia="Times New Roman" w:hAnsi="Aptos Display" w:cs="Times New Roman"/>
-          <w:sz w:val="24"/>
-          <w:szCs w:val="24"/>
-        </w:rPr>
-        <w:t>Maintained and monitored interfaces across distributed systems to ensure reliable data exchange</w:t>
-      </w:r>
-    </w:p>
-    <w:p>
-      <w:pPr>
-        <w:numPr>
-          <w:ilvl w:val="0"/>
-          <w:numId w:val="26"/>
-        </w:numPr>
-        <w:spacing w:after="160"/>
-        <w:rPr>
-          <w:rFonts w:ascii="Aptos Display" w:hAnsi="Aptos Display" w:cs="Times New Roman"/>
-          <w:bCs/>
-          <w:w w:val="105"/>
-          <w:sz w:val="24"/>
-          <w:szCs w:val="24"/>
-        </w:rPr>
-      </w:pPr>
-      <w:r>
-        <w:rPr>
-          <w:rFonts w:ascii="Aptos Display" w:hAnsi="Aptos Display" w:cs="Times New Roman"/>
-          <w:bCs/>
-          <w:w w:val="105"/>
-          <w:sz w:val="24"/>
-          <w:szCs w:val="24"/>
-        </w:rPr>
-        <w:t>Worked within regulated environments requiring stable and secure system operation</w:t>
-      </w:r>
-    </w:p>
-    <w:p>
-      <w:pPr>
-        <w:spacing w:before="106"/>
-        <w:ind w:left="360"/>
-        <w:rPr>
-          <w:rFonts w:ascii="Aptos Display" w:hAnsi="Aptos Display"/>
-          <w:b/>
-          <w:bCs/>
-          <w:w w:val="105"/>
-          <w:sz w:val="26"/>
-          <w:szCs w:val="26"/>
-        </w:rPr>
-      </w:pPr>
-      <w:r>
-        <w:rPr>
-          <w:rFonts w:ascii="Aptos Display" w:hAnsi="Aptos Display"/>
-          <w:b/>
-          <w:bCs/>
-          <w:w w:val="105"/>
-          <w:sz w:val="26"/>
-          <w:szCs w:val="26"/>
-        </w:rPr>
-        <w:t>Computer Sciences Corporation — Senior Consultant</w:t>
-      </w:r>
-    </w:p>
-    <w:p>
-      <w:pPr>
-        <w:keepNext/>
-        <w:keepLines/>
-        <w:widowControl/>
-        <w:autoSpaceDE/>
-        <w:autoSpaceDN/>
-        <w:spacing w:after="160"/>
-        <w:ind w:left="330" w:right="680"/>
-        <w:rPr>
-          <w:rFonts w:ascii="Aptos Display" w:eastAsia="Times New Roman" w:hAnsi="Aptos Display" w:cs="Times New Roman"/>
-          <w:sz w:val="24"/>
-          <w:szCs w:val="24"/>
-        </w:rPr>
-      </w:pPr>
-      <w:r>
-        <w:rPr>
-          <w:rFonts w:ascii="Aptos Display" w:eastAsia="Times New Roman" w:hAnsi="Aptos Display" w:cs="Times New Roman"/>
-          <w:sz w:val="24"/>
-          <w:szCs w:val="24"/>
-        </w:rPr>
-        <w:t>10/</w:t>
-      </w:r>
-      <w:r>
-        <w:rPr>
-          <w:rFonts w:ascii="Aptos Display" w:eastAsia="Times New Roman" w:hAnsi="Aptos Display" w:cs="Times New Roman"/>
-          <w:sz w:val="24"/>
-          <w:szCs w:val="24"/>
-        </w:rPr>
-        <w:t xml:space="preserve">2001 – </w:t>
-      </w:r>
-      <w:r>
-        <w:rPr>
-          <w:rFonts w:ascii="Aptos Display" w:eastAsia="Times New Roman" w:hAnsi="Aptos Display" w:cs="Times New Roman"/>
-          <w:sz w:val="24"/>
-          <w:szCs w:val="24"/>
-        </w:rPr>
-        <w:t>10/</w:t>
-      </w:r>
-      <w:r>
-        <w:rPr>
-          <w:rFonts w:ascii="Aptos Display" w:eastAsia="Times New Roman" w:hAnsi="Aptos Display" w:cs="Times New Roman"/>
-          <w:sz w:val="24"/>
-          <w:szCs w:val="24"/>
-        </w:rPr>
-        <w:t>2002</w:t>
-      </w:r>
-    </w:p>
-    <w:p>
-      <w:pPr>
-        <w:pStyle w:val="ListParagraph"/>
-        <w:widowControl/>
-        <w:numPr>
-          <w:ilvl w:val="0"/>
-          <w:numId w:val="27"/>
-        </w:numPr>
-        <w:autoSpaceDE/>
-        <w:autoSpaceDN/>
-        <w:ind w:right="680"/>
-        <w:rPr>
-          <w:rFonts w:ascii="Aptos Display" w:eastAsia="Times New Roman" w:hAnsi="Aptos Display" w:cs="Times New Roman"/>
-          <w:sz w:val="24"/>
-          <w:szCs w:val="24"/>
-        </w:rPr>
-      </w:pPr>
-      <w:r>
-        <w:rPr>
-          <w:rFonts w:ascii="Aptos Display" w:eastAsia="Times New Roman" w:hAnsi="Aptos Display" w:cs="Times New Roman"/>
-          <w:sz w:val="24"/>
-          <w:szCs w:val="24"/>
-        </w:rPr>
-        <w:t>Supported enterprise integration systems and assisted in resolving system connectivity and data exchange issues</w:t>
-      </w:r>
-    </w:p>
-    <w:p>
-      <w:pPr>
-        <w:numPr>
-          <w:ilvl w:val="0"/>
-          <w:numId w:val="26"/>
-        </w:numPr>
-        <w:spacing w:after="160"/>
-        <w:rPr>
-          <w:rFonts w:ascii="Aptos Display" w:hAnsi="Aptos Display" w:cs="Times New Roman"/>
-          <w:bCs/>
-          <w:w w:val="105"/>
-          <w:sz w:val="24"/>
-          <w:szCs w:val="24"/>
-        </w:rPr>
-      </w:pPr>
-      <w:r>
-        <w:rPr>
-          <w:rFonts w:ascii="Aptos Display" w:hAnsi="Aptos Display" w:cs="Times New Roman"/>
-          <w:bCs/>
-          <w:w w:val="105"/>
-          <w:sz w:val="24"/>
-          <w:szCs w:val="24"/>
-        </w:rPr>
-        <w:t>Developed and maintained middleware components supporting large-scale environments</w:t>
-      </w:r>
-    </w:p>
-    <w:p>
-      <w:pPr>
-        <w:spacing w:before="106"/>
-        <w:ind w:left="360"/>
-        <w:rPr>
-          <w:rFonts w:ascii="Aptos Display" w:hAnsi="Aptos Display"/>
-          <w:b/>
-          <w:bCs/>
-          <w:w w:val="105"/>
-          <w:sz w:val="26"/>
-          <w:szCs w:val="26"/>
-        </w:rPr>
-      </w:pPr>
-      <w:r>
-        <w:rPr>
-          <w:rFonts w:ascii="Aptos Display" w:hAnsi="Aptos Display"/>
-          <w:b/>
-          <w:bCs/>
-          <w:w w:val="105"/>
-          <w:sz w:val="26"/>
-          <w:szCs w:val="26"/>
-        </w:rPr>
-        <w:t>Fluor Corporation — EAI Team Lead</w:t>
-      </w:r>
-    </w:p>
-    <w:p>
-      <w:pPr>
-        <w:keepNext/>
-        <w:keepLines/>
-        <w:widowControl/>
-        <w:autoSpaceDE/>
-        <w:autoSpaceDN/>
-        <w:spacing w:after="160"/>
-        <w:ind w:left="330" w:right="680"/>
-        <w:rPr>
-          <w:rFonts w:ascii="Aptos Display" w:eastAsia="Times New Roman" w:hAnsi="Aptos Display" w:cs="Times New Roman"/>
-          <w:sz w:val="24"/>
-          <w:szCs w:val="24"/>
-        </w:rPr>
-      </w:pPr>
-      <w:r>
-        <w:rPr>
-          <w:rFonts w:ascii="Aptos Display" w:eastAsia="Times New Roman" w:hAnsi="Aptos Display" w:cs="Times New Roman"/>
-          <w:sz w:val="24"/>
-          <w:szCs w:val="24"/>
-        </w:rPr>
-        <w:t>01/</w:t>
-      </w:r>
-      <w:r>
-        <w:rPr>
-          <w:rFonts w:ascii="Aptos Display" w:eastAsia="Times New Roman" w:hAnsi="Aptos Display" w:cs="Times New Roman"/>
-          <w:sz w:val="24"/>
-          <w:szCs w:val="24"/>
-        </w:rPr>
-        <w:t xml:space="preserve">1999 – </w:t>
-      </w:r>
-      <w:r>
-        <w:rPr>
-          <w:rFonts w:ascii="Aptos Display" w:eastAsia="Times New Roman" w:hAnsi="Aptos Display" w:cs="Times New Roman"/>
-          <w:sz w:val="24"/>
-          <w:szCs w:val="24"/>
-        </w:rPr>
-        <w:t>10/</w:t>
-      </w:r>
-      <w:r>
-        <w:rPr>
-          <w:rFonts w:ascii="Aptos Display" w:eastAsia="Times New Roman" w:hAnsi="Aptos Display" w:cs="Times New Roman"/>
-          <w:sz w:val="24"/>
-          <w:szCs w:val="24"/>
-        </w:rPr>
-        <w:t>2001</w:t>
-      </w:r>
-    </w:p>
-    <w:p>
-      <w:pPr>
-        <w:pStyle w:val="ListParagraph"/>
-        <w:widowControl/>
-        <w:numPr>
-          <w:ilvl w:val="0"/>
-          <w:numId w:val="27"/>
-        </w:numPr>
-        <w:autoSpaceDE/>
-        <w:autoSpaceDN/>
-        <w:ind w:right="680"/>
-        <w:rPr>
-          <w:rFonts w:ascii="Aptos Display" w:eastAsia="Times New Roman" w:hAnsi="Aptos Display" w:cs="Times New Roman"/>
-          <w:sz w:val="24"/>
-          <w:szCs w:val="24"/>
-        </w:rPr>
-      </w:pPr>
-      <w:r>
-        <w:rPr>
-          <w:rFonts w:ascii="Aptos Display" w:eastAsia="Times New Roman" w:hAnsi="Aptos Display" w:cs="Times New Roman"/>
-          <w:sz w:val="24"/>
-          <w:szCs w:val="24"/>
-        </w:rPr>
-        <w:t>Supported enterprise messaging and integration infrastructure</w:t>
-      </w:r>
-    </w:p>
-    <w:p>
-      <w:pPr>
-        <w:pStyle w:val="ListParagraph"/>
-        <w:widowControl/>
-        <w:numPr>
-          <w:ilvl w:val="0"/>
-          <w:numId w:val="27"/>
-        </w:numPr>
-        <w:autoSpaceDE/>
-        <w:autoSpaceDN/>
-        <w:ind w:right="680"/>
-        <w:rPr>
-          <w:rFonts w:ascii="Aptos Display" w:eastAsia="Times New Roman" w:hAnsi="Aptos Display" w:cs="Times New Roman"/>
-          <w:sz w:val="24"/>
-          <w:szCs w:val="24"/>
-        </w:rPr>
-      </w:pPr>
-      <w:r>
-        <w:rPr>
-          <w:rFonts w:ascii="Aptos Display" w:eastAsia="Times New Roman" w:hAnsi="Aptos Display" w:cs="Times New Roman"/>
-          <w:sz w:val="24"/>
-          <w:szCs w:val="24"/>
-        </w:rPr>
-        <w:t>Conducted troubleshooting and validation of system communication across platforms</w:t>
-      </w:r>
-    </w:p>
-    <w:p>
-      <w:pPr>
-        <w:numPr>
-          <w:ilvl w:val="0"/>
-          <w:numId w:val="26"/>
-        </w:numPr>
-        <w:spacing w:after="160"/>
-        <w:rPr>
-          <w:rFonts w:ascii="Aptos Display" w:hAnsi="Aptos Display" w:cs="Times New Roman"/>
-          <w:bCs/>
-          <w:w w:val="105"/>
-          <w:sz w:val="24"/>
-          <w:szCs w:val="24"/>
-        </w:rPr>
-      </w:pPr>
-      <w:r>
-        <w:rPr>
-          <w:rFonts w:ascii="Aptos Display" w:hAnsi="Aptos Display" w:cs="Times New Roman"/>
-          <w:bCs/>
-          <w:w w:val="105"/>
-          <w:sz w:val="24"/>
-          <w:szCs w:val="24"/>
-        </w:rPr>
-        <w:t>Assisted with infrastructure transitions during legacy-to-SAP migrations</w:t>
-      </w:r>
-    </w:p>
-    <w:p>
-      <w:pPr>
-        <w:keepNext/>
-        <w:keepLines/>
-        <w:widowControl/>
-        <w:spacing w:before="106"/>
-        <w:ind w:left="360"/>
-        <w:rPr>
-          <w:rFonts w:ascii="Aptos Display" w:hAnsi="Aptos Display"/>
-          <w:b/>
-          <w:bCs/>
-          <w:w w:val="105"/>
-          <w:sz w:val="26"/>
-          <w:szCs w:val="26"/>
-        </w:rPr>
-      </w:pPr>
-      <w:r>
-        <w:rPr>
-          <w:rFonts w:ascii="Aptos Display" w:hAnsi="Aptos Display"/>
-          <w:b/>
-          <w:bCs/>
-          <w:w w:val="105"/>
-          <w:sz w:val="26"/>
-          <w:szCs w:val="26"/>
-        </w:rPr>
-        <w:lastRenderedPageBreak/>
-        <w:t>PM Realty Group — MIS Manager</w:t>
-      </w:r>
-    </w:p>
-    <w:p>
-      <w:pPr>
-        <w:keepNext/>
-        <w:keepLines/>
-        <w:widowControl/>
-        <w:autoSpaceDE/>
-        <w:autoSpaceDN/>
-        <w:spacing w:after="160"/>
-        <w:ind w:left="330" w:right="680"/>
-        <w:rPr>
-          <w:rFonts w:ascii="Aptos Display" w:eastAsia="Times New Roman" w:hAnsi="Aptos Display" w:cs="Times New Roman"/>
-          <w:sz w:val="24"/>
-          <w:szCs w:val="24"/>
-        </w:rPr>
-      </w:pPr>
-      <w:r>
-        <w:rPr>
-          <w:rFonts w:ascii="Aptos Display" w:eastAsia="Times New Roman" w:hAnsi="Aptos Display" w:cs="Times New Roman"/>
-          <w:sz w:val="24"/>
-          <w:szCs w:val="24"/>
-        </w:rPr>
-        <w:t>01/</w:t>
-      </w:r>
-      <w:r>
-        <w:rPr>
-          <w:rFonts w:ascii="Aptos Display" w:eastAsia="Times New Roman" w:hAnsi="Aptos Display" w:cs="Times New Roman"/>
-          <w:sz w:val="24"/>
-          <w:szCs w:val="24"/>
-        </w:rPr>
-        <w:t xml:space="preserve">1996 – </w:t>
-      </w:r>
-      <w:r>
-        <w:rPr>
-          <w:rFonts w:ascii="Aptos Display" w:eastAsia="Times New Roman" w:hAnsi="Aptos Display" w:cs="Times New Roman"/>
-          <w:sz w:val="24"/>
-          <w:szCs w:val="24"/>
-        </w:rPr>
-        <w:t>01/</w:t>
-      </w:r>
-      <w:r>
-        <w:rPr>
-          <w:rFonts w:ascii="Aptos Display" w:eastAsia="Times New Roman" w:hAnsi="Aptos Display" w:cs="Times New Roman"/>
-          <w:sz w:val="24"/>
-          <w:szCs w:val="24"/>
-        </w:rPr>
-        <w:t>1999</w:t>
       </w:r>
     </w:p>
     <w:p>
@@ -1743,7 +893,222 @@
           <w:sz w:val="24"/>
           <w:szCs w:val="24"/>
         </w:rPr>
-        <w:t>Managed IT operations, including network infrastructure, system connectivity, and user support</w:t>
+        <w:t xml:space="preserve">Troubleshot and resolved production issues across distributed systems, including database, </w:t>
+      </w:r>
+      <w:r>
+        <w:rPr>
+          <w:rFonts w:ascii="Aptos Display" w:eastAsia="Times New Roman" w:hAnsi="Aptos Display" w:cs="Times New Roman"/>
+          <w:sz w:val="24"/>
+          <w:szCs w:val="24"/>
+        </w:rPr>
+        <w:t>integration services</w:t>
+      </w:r>
+      <w:r>
+        <w:rPr>
+          <w:rFonts w:ascii="Aptos Display" w:eastAsia="Times New Roman" w:hAnsi="Aptos Display" w:cs="Times New Roman"/>
+          <w:sz w:val="24"/>
+          <w:szCs w:val="24"/>
+        </w:rPr>
+        <w:t xml:space="preserve">, and </w:t>
+      </w:r>
+      <w:r>
+        <w:rPr>
+          <w:rFonts w:ascii="Aptos Display" w:eastAsia="Times New Roman" w:hAnsi="Aptos Display" w:cs="Times New Roman"/>
+          <w:sz w:val="24"/>
+          <w:szCs w:val="24"/>
+        </w:rPr>
+        <w:t>connectivity and infrastructure-related failures</w:t>
+      </w:r>
+    </w:p>
+    <w:p>
+      <w:pPr>
+        <w:pStyle w:val="ListParagraph"/>
+        <w:keepNext/>
+        <w:keepLines/>
+        <w:widowControl/>
+        <w:numPr>
+          <w:ilvl w:val="0"/>
+          <w:numId w:val="27"/>
+        </w:numPr>
+        <w:autoSpaceDE/>
+        <w:autoSpaceDN/>
+        <w:ind w:right="680"/>
+        <w:rPr>
+          <w:rFonts w:ascii="Aptos Display" w:eastAsia="Times New Roman" w:hAnsi="Aptos Display" w:cs="Times New Roman"/>
+          <w:sz w:val="24"/>
+          <w:szCs w:val="24"/>
+        </w:rPr>
+      </w:pPr>
+      <w:r>
+        <w:rPr>
+          <w:rFonts w:ascii="Aptos Display" w:eastAsia="Times New Roman" w:hAnsi="Aptos Display" w:cs="Times New Roman"/>
+          <w:sz w:val="24"/>
+          <w:szCs w:val="24"/>
+        </w:rPr>
+        <w:t>Supported enterprise data platforms and integration systems, ensuring reliable system performance and uptime</w:t>
+      </w:r>
+    </w:p>
+    <w:p>
+      <w:pPr>
+        <w:pStyle w:val="ListParagraph"/>
+        <w:keepNext/>
+        <w:keepLines/>
+        <w:widowControl/>
+        <w:numPr>
+          <w:ilvl w:val="0"/>
+          <w:numId w:val="27"/>
+        </w:numPr>
+        <w:autoSpaceDE/>
+        <w:autoSpaceDN/>
+        <w:ind w:right="680"/>
+        <w:rPr>
+          <w:rFonts w:ascii="Aptos Display" w:eastAsia="Times New Roman" w:hAnsi="Aptos Display" w:cs="Times New Roman"/>
+          <w:sz w:val="24"/>
+          <w:szCs w:val="24"/>
+        </w:rPr>
+      </w:pPr>
+      <w:r>
+        <w:rPr>
+          <w:rFonts w:ascii="Aptos Display" w:eastAsia="Times New Roman" w:hAnsi="Aptos Display" w:cs="Times New Roman"/>
+          <w:sz w:val="24"/>
+          <w:szCs w:val="24"/>
+        </w:rPr>
+        <w:t>Diagnosed performance bottlenecks and system slowdowns, improving responsiveness and stability</w:t>
+      </w:r>
+    </w:p>
+    <w:p>
+      <w:pPr>
+        <w:pStyle w:val="ListParagraph"/>
+        <w:keepNext/>
+        <w:keepLines/>
+        <w:widowControl/>
+        <w:numPr>
+          <w:ilvl w:val="0"/>
+          <w:numId w:val="27"/>
+        </w:numPr>
+        <w:autoSpaceDE/>
+        <w:autoSpaceDN/>
+        <w:ind w:right="680"/>
+        <w:rPr>
+          <w:rFonts w:ascii="Aptos Display" w:eastAsia="Times New Roman" w:hAnsi="Aptos Display" w:cs="Times New Roman"/>
+          <w:sz w:val="24"/>
+          <w:szCs w:val="24"/>
+        </w:rPr>
+      </w:pPr>
+      <w:r>
+        <w:rPr>
+          <w:rFonts w:ascii="Aptos Display" w:eastAsia="Times New Roman" w:hAnsi="Aptos Display" w:cs="Times New Roman"/>
+          <w:sz w:val="24"/>
+          <w:szCs w:val="24"/>
+        </w:rPr>
+        <w:t>Collaborated with infrastructure and development teams to resolve system-level issues impacting application performance</w:t>
+      </w:r>
+    </w:p>
+    <w:p>
+      <w:pPr>
+        <w:numPr>
+          <w:ilvl w:val="0"/>
+          <w:numId w:val="26"/>
+        </w:numPr>
+        <w:spacing w:after="160"/>
+        <w:rPr>
+          <w:rFonts w:ascii="Aptos Display" w:hAnsi="Aptos Display" w:cs="Times New Roman"/>
+          <w:bCs/>
+          <w:w w:val="105"/>
+          <w:sz w:val="24"/>
+          <w:szCs w:val="24"/>
+        </w:rPr>
+      </w:pPr>
+      <w:r>
+        <w:rPr>
+          <w:rFonts w:ascii="Aptos Display" w:hAnsi="Aptos Display" w:cs="Times New Roman"/>
+          <w:bCs/>
+          <w:w w:val="105"/>
+          <w:sz w:val="24"/>
+          <w:szCs w:val="24"/>
+        </w:rPr>
+        <w:t>Worked with cloud-hosted environments (Azure SQL and related services) to maintain system reliability</w:t>
+      </w:r>
+    </w:p>
+    <w:p>
+      <w:pPr>
+        <w:spacing w:before="106"/>
+        <w:ind w:left="360"/>
+        <w:rPr>
+          <w:rFonts w:ascii="Aptos Display" w:hAnsi="Aptos Display"/>
+          <w:b/>
+          <w:bCs/>
+          <w:w w:val="105"/>
+          <w:sz w:val="26"/>
+          <w:szCs w:val="26"/>
+        </w:rPr>
+      </w:pPr>
+      <w:r>
+        <w:rPr>
+          <w:rFonts w:ascii="Aptos Display" w:hAnsi="Aptos Display"/>
+          <w:b/>
+          <w:bCs/>
+          <w:w w:val="105"/>
+          <w:sz w:val="26"/>
+          <w:szCs w:val="26"/>
+        </w:rPr>
+        <w:t>Independent Consultant</w:t>
+      </w:r>
+    </w:p>
+    <w:p>
+      <w:pPr>
+        <w:ind w:left="331"/>
+        <w:rPr>
+          <w:rFonts w:ascii="Aptos Display" w:hAnsi="Aptos Display"/>
+          <w:spacing w:val="-4"/>
+          <w:w w:val="105"/>
+          <w:sz w:val="26"/>
+          <w:szCs w:val="26"/>
+        </w:rPr>
+      </w:pPr>
+      <w:r>
+        <w:rPr>
+          <w:rFonts w:ascii="Aptos Display" w:hAnsi="Aptos Display"/>
+          <w:spacing w:val="-4"/>
+          <w:w w:val="105"/>
+          <w:sz w:val="26"/>
+          <w:szCs w:val="26"/>
+        </w:rPr>
+        <w:t xml:space="preserve">Industry / Client Focus: </w:t>
+      </w:r>
+      <w:r>
+        <w:rPr>
+          <w:rFonts w:ascii="Aptos Display" w:hAnsi="Aptos Display"/>
+          <w:spacing w:val="-4"/>
+          <w:w w:val="105"/>
+          <w:sz w:val="26"/>
+          <w:szCs w:val="26"/>
+        </w:rPr>
+        <w:t>legacy modernization enterprise applications</w:t>
+      </w:r>
+    </w:p>
+    <w:p>
+      <w:pPr>
+        <w:keepNext/>
+        <w:keepLines/>
+        <w:widowControl/>
+        <w:autoSpaceDE/>
+        <w:autoSpaceDN/>
+        <w:spacing w:after="160"/>
+        <w:ind w:left="330" w:right="680"/>
+        <w:rPr>
+          <w:rFonts w:ascii="Aptos Display" w:eastAsia="Times New Roman" w:hAnsi="Aptos Display" w:cs="Times New Roman"/>
+          <w:sz w:val="24"/>
+          <w:szCs w:val="24"/>
+        </w:rPr>
+      </w:pPr>
+      <w:r>
+        <w:rPr>
+          <w:rFonts w:ascii="Aptos Display" w:eastAsia="Times New Roman" w:hAnsi="Aptos Display" w:cs="Times New Roman"/>
+          <w:sz w:val="24"/>
+          <w:szCs w:val="24"/>
+        </w:rPr>
+        <w:t>03/2014 – 08/2015</w:t>
       </w:r>
     </w:p>
     <w:p>
@@ -1769,104 +1134,39 @@
           <w:sz w:val="24"/>
           <w:szCs w:val="24"/>
         </w:rPr>
-        <w:t>Led LAN/WAN upgrades and ensured reliable communication across office locations</w:t>
-      </w:r>
-    </w:p>
-    <w:p>
-      <w:pPr>
-        <w:numPr>
-          <w:ilvl w:val="0"/>
-          <w:numId w:val="26"/>
-        </w:numPr>
-        <w:spacing w:after="160"/>
-        <w:rPr>
-          <w:rFonts w:ascii="Aptos Display" w:hAnsi="Aptos Display" w:cs="Times New Roman"/>
-          <w:bCs/>
-          <w:w w:val="105"/>
-          <w:sz w:val="24"/>
-          <w:szCs w:val="24"/>
-        </w:rPr>
-      </w:pPr>
-      <w:r>
-        <w:rPr>
-          <w:rFonts w:ascii="Aptos Display" w:hAnsi="Aptos Display" w:cs="Times New Roman"/>
-          <w:bCs/>
-          <w:w w:val="105"/>
-          <w:sz w:val="24"/>
-          <w:szCs w:val="24"/>
-        </w:rPr>
-        <w:t>Supported business-critical systems and provided hands-on technical troubleshooting</w:t>
-      </w:r>
-    </w:p>
-    <w:p>
-      <w:pPr>
-        <w:spacing w:before="106"/>
-        <w:ind w:left="360"/>
-        <w:rPr>
-          <w:rFonts w:ascii="Aptos Display" w:hAnsi="Aptos Display"/>
-          <w:b/>
-          <w:bCs/>
-          <w:w w:val="105"/>
-          <w:sz w:val="26"/>
-          <w:szCs w:val="26"/>
-        </w:rPr>
-      </w:pPr>
-      <w:r>
-        <w:rPr>
-          <w:rFonts w:ascii="Aptos Display" w:hAnsi="Aptos Display"/>
-          <w:b/>
-          <w:bCs/>
-          <w:w w:val="105"/>
-          <w:sz w:val="26"/>
-          <w:szCs w:val="26"/>
-        </w:rPr>
-        <w:t>Access Development Corp — System Administrator / Programmer</w:t>
-      </w:r>
-    </w:p>
-    <w:p>
-      <w:pPr>
-        <w:widowControl/>
-        <w:autoSpaceDE/>
-        <w:autoSpaceDN/>
-        <w:spacing w:after="160"/>
-        <w:ind w:left="330" w:right="680"/>
-        <w:rPr>
-          <w:rFonts w:ascii="Aptos Display" w:eastAsia="Times New Roman" w:hAnsi="Aptos Display" w:cs="Times New Roman"/>
-          <w:sz w:val="24"/>
-          <w:szCs w:val="24"/>
-        </w:rPr>
-      </w:pPr>
-      <w:r>
-        <w:rPr>
-          <w:rFonts w:ascii="Aptos Display" w:eastAsia="Times New Roman" w:hAnsi="Aptos Display" w:cs="Times New Roman"/>
-          <w:sz w:val="24"/>
-          <w:szCs w:val="24"/>
-        </w:rPr>
-        <w:t>05/</w:t>
-      </w:r>
-      <w:r>
-        <w:rPr>
-          <w:rFonts w:ascii="Aptos Display" w:eastAsia="Times New Roman" w:hAnsi="Aptos Display" w:cs="Times New Roman"/>
-          <w:sz w:val="24"/>
-          <w:szCs w:val="24"/>
-        </w:rPr>
-        <w:t xml:space="preserve">1986 – </w:t>
-      </w:r>
-      <w:r>
-        <w:rPr>
-          <w:rFonts w:ascii="Aptos Display" w:eastAsia="Times New Roman" w:hAnsi="Aptos Display" w:cs="Times New Roman"/>
-          <w:sz w:val="24"/>
-          <w:szCs w:val="24"/>
-        </w:rPr>
-        <w:t>01/</w:t>
-      </w:r>
-      <w:r>
-        <w:rPr>
-          <w:rFonts w:ascii="Aptos Display" w:eastAsia="Times New Roman" w:hAnsi="Aptos Display" w:cs="Times New Roman"/>
-          <w:sz w:val="24"/>
-          <w:szCs w:val="24"/>
-        </w:rPr>
-        <w:t>1996</w:t>
+        <w:t xml:space="preserve">Delivered custom .NET/MVC and </w:t>
+      </w:r>
+      <w:r>
+        <w:rPr>
+          <w:rFonts w:ascii="Aptos Display" w:eastAsia="Times New Roman" w:hAnsi="Aptos Display" w:cs="Times New Roman"/>
+          <w:sz w:val="24"/>
+          <w:szCs w:val="24"/>
+        </w:rPr>
+        <w:t>web applications</w:t>
+      </w:r>
+      <w:r>
+        <w:rPr>
+          <w:rFonts w:ascii="Aptos Display" w:eastAsia="Times New Roman" w:hAnsi="Aptos Display" w:cs="Times New Roman"/>
+          <w:sz w:val="24"/>
+          <w:szCs w:val="24"/>
+        </w:rPr>
+        <w:t xml:space="preserve"> using HTML5, CSS3, JavaScript, and </w:t>
+      </w:r>
+      <w:r>
+        <w:rPr>
+          <w:rFonts w:ascii="Aptos Display" w:eastAsia="Times New Roman" w:hAnsi="Aptos Display" w:cs="Times New Roman"/>
+          <w:sz w:val="24"/>
+          <w:szCs w:val="24"/>
+        </w:rPr>
+        <w:t>Database-backed application architecture</w:t>
+      </w:r>
+      <w:r>
+        <w:rPr>
+          <w:rFonts w:ascii="Aptos Display" w:eastAsia="Times New Roman" w:hAnsi="Aptos Display" w:cs="Times New Roman"/>
+          <w:sz w:val="24"/>
+          <w:szCs w:val="24"/>
+        </w:rPr>
+        <w:t>.</w:t>
       </w:r>
     </w:p>
     <w:p>
@@ -1892,7 +1192,182 @@
           <w:sz w:val="24"/>
           <w:szCs w:val="24"/>
         </w:rPr>
-        <w:t>Administered LAN-based systems and supported internal users with hardware and software issues</w:t>
+        <w:t>Built responsive UI, database-driven workflows, reporting views, and analytics outputs for small business and enterprise use cases.</w:t>
+      </w:r>
+    </w:p>
+    <w:p>
+      <w:pPr>
+        <w:numPr>
+          <w:ilvl w:val="0"/>
+          <w:numId w:val="26"/>
+        </w:numPr>
+        <w:spacing w:after="160"/>
+        <w:rPr>
+          <w:rFonts w:ascii="Aptos Display" w:hAnsi="Aptos Display" w:cs="Times New Roman"/>
+          <w:bCs/>
+          <w:w w:val="105"/>
+          <w:sz w:val="24"/>
+          <w:szCs w:val="24"/>
+        </w:rPr>
+      </w:pPr>
+      <w:r>
+        <w:rPr>
+          <w:rFonts w:ascii="Aptos Display" w:hAnsi="Aptos Display" w:cs="Times New Roman"/>
+          <w:bCs/>
+          <w:w w:val="105"/>
+          <w:sz w:val="24"/>
+          <w:szCs w:val="24"/>
+        </w:rPr>
+        <w:t xml:space="preserve">Supported legacy modernization by integrating older systems with web applications, relational databases, APIs, and </w:t>
+      </w:r>
+      <w:r>
+        <w:rPr>
+          <w:rFonts w:ascii="Aptos Display" w:hAnsi="Aptos Display" w:cs="Times New Roman"/>
+          <w:bCs/>
+          <w:w w:val="105"/>
+          <w:sz w:val="24"/>
+          <w:szCs w:val="24"/>
+        </w:rPr>
+        <w:t>integration services</w:t>
+      </w:r>
+      <w:r>
+        <w:rPr>
+          <w:rFonts w:ascii="Aptos Display" w:hAnsi="Aptos Display" w:cs="Times New Roman"/>
+          <w:bCs/>
+          <w:w w:val="105"/>
+          <w:sz w:val="24"/>
+          <w:szCs w:val="24"/>
+        </w:rPr>
+        <w:t>-style data flows.</w:t>
+      </w:r>
+    </w:p>
+    <w:p>
+      <w:pPr>
+        <w:spacing w:before="106"/>
+        <w:ind w:left="360"/>
+        <w:rPr>
+          <w:rFonts w:ascii="Aptos Display" w:hAnsi="Aptos Display"/>
+          <w:b/>
+          <w:bCs/>
+          <w:w w:val="105"/>
+          <w:sz w:val="26"/>
+          <w:szCs w:val="26"/>
+        </w:rPr>
+      </w:pPr>
+      <w:r>
+        <w:rPr>
+          <w:rFonts w:ascii="Aptos Display" w:hAnsi="Aptos Display"/>
+          <w:b/>
+          <w:bCs/>
+          <w:w w:val="105"/>
+          <w:sz w:val="26"/>
+          <w:szCs w:val="26"/>
+        </w:rPr>
+        <w:t>Steton Technology Group — Lead Architect</w:t>
+      </w:r>
+    </w:p>
+    <w:p>
+      <w:pPr>
+        <w:ind w:left="331"/>
+        <w:rPr>
+          <w:rFonts w:ascii="Aptos Display" w:hAnsi="Aptos Display"/>
+          <w:spacing w:val="-4"/>
+          <w:w w:val="105"/>
+          <w:sz w:val="26"/>
+          <w:szCs w:val="26"/>
+        </w:rPr>
+      </w:pPr>
+      <w:r>
+        <w:rPr>
+          <w:rFonts w:ascii="Aptos Display" w:hAnsi="Aptos Display"/>
+          <w:spacing w:val="-4"/>
+          <w:w w:val="105"/>
+          <w:sz w:val="26"/>
+          <w:szCs w:val="26"/>
+        </w:rPr>
+        <w:t xml:space="preserve">Industry / Client Focus: </w:t>
+      </w:r>
+      <w:r>
+        <w:rPr>
+          <w:rFonts w:ascii="Aptos Display" w:hAnsi="Aptos Display"/>
+          <w:spacing w:val="-4"/>
+          <w:w w:val="105"/>
+          <w:sz w:val="26"/>
+          <w:szCs w:val="26"/>
+        </w:rPr>
+        <w:t>Food &amp; Hospitality, SaaS platforms, mobile data collection</w:t>
+      </w:r>
+    </w:p>
+    <w:p>
+      <w:pPr>
+        <w:keepNext/>
+        <w:keepLines/>
+        <w:widowControl/>
+        <w:autoSpaceDE/>
+        <w:autoSpaceDN/>
+        <w:spacing w:after="160"/>
+        <w:ind w:left="330" w:right="680"/>
+        <w:rPr>
+          <w:rFonts w:ascii="Aptos Display" w:eastAsia="Times New Roman" w:hAnsi="Aptos Display" w:cs="Times New Roman"/>
+          <w:sz w:val="24"/>
+          <w:szCs w:val="24"/>
+        </w:rPr>
+      </w:pPr>
+      <w:r>
+        <w:rPr>
+          <w:rFonts w:ascii="Aptos Display" w:eastAsia="Times New Roman" w:hAnsi="Aptos Display" w:cs="Times New Roman"/>
+          <w:sz w:val="24"/>
+          <w:szCs w:val="24"/>
+        </w:rPr>
+        <w:t>01/</w:t>
+      </w:r>
+      <w:r>
+        <w:rPr>
+          <w:rFonts w:ascii="Aptos Display" w:eastAsia="Times New Roman" w:hAnsi="Aptos Display" w:cs="Times New Roman"/>
+          <w:sz w:val="24"/>
+          <w:szCs w:val="24"/>
+        </w:rPr>
+        <w:t>200</w:t>
+      </w:r>
+      <w:r>
+        <w:rPr>
+          <w:rFonts w:ascii="Aptos Display" w:eastAsia="Times New Roman" w:hAnsi="Aptos Display" w:cs="Times New Roman"/>
+          <w:sz w:val="24"/>
+          <w:szCs w:val="24"/>
+        </w:rPr>
+        <w:t>4</w:t>
+      </w:r>
+      <w:r>
+        <w:rPr>
+          <w:rFonts w:ascii="Aptos Display" w:eastAsia="Times New Roman" w:hAnsi="Aptos Display" w:cs="Times New Roman"/>
+          <w:sz w:val="24"/>
+          <w:szCs w:val="24"/>
+        </w:rPr>
+        <w:t xml:space="preserve"> – </w:t>
+      </w:r>
+      <w:r>
+        <w:rPr>
+          <w:rFonts w:ascii="Aptos Display" w:eastAsia="Times New Roman" w:hAnsi="Aptos Display" w:cs="Times New Roman"/>
+          <w:sz w:val="24"/>
+          <w:szCs w:val="24"/>
+        </w:rPr>
+        <w:t>03/</w:t>
+      </w:r>
+      <w:r>
+        <w:rPr>
+          <w:rFonts w:ascii="Aptos Display" w:eastAsia="Times New Roman" w:hAnsi="Aptos Display" w:cs="Times New Roman"/>
+          <w:sz w:val="24"/>
+          <w:szCs w:val="24"/>
+        </w:rPr>
+        <w:t>201</w:t>
+      </w:r>
+      <w:r>
+        <w:rPr>
+          <w:rFonts w:ascii="Aptos Display" w:eastAsia="Times New Roman" w:hAnsi="Aptos Display" w:cs="Times New Roman"/>
+          <w:sz w:val="24"/>
+          <w:szCs w:val="24"/>
+        </w:rPr>
+        <w:t>4</w:t>
       </w:r>
     </w:p>
     <w:p>
@@ -1918,7 +1393,59 @@
           <w:sz w:val="24"/>
           <w:szCs w:val="24"/>
         </w:rPr>
-        <w:t>Installed, configured, and maintained business applications and system environments</w:t>
+        <w:t>Led operation and support of a multi-tenant SaaS platform, including system monitoring, issue resolution, and performance tuning</w:t>
+      </w:r>
+    </w:p>
+    <w:p>
+      <w:pPr>
+        <w:pStyle w:val="ListParagraph"/>
+        <w:widowControl/>
+        <w:numPr>
+          <w:ilvl w:val="0"/>
+          <w:numId w:val="27"/>
+        </w:numPr>
+        <w:autoSpaceDE/>
+        <w:autoSpaceDN/>
+        <w:ind w:right="680"/>
+        <w:rPr>
+          <w:rFonts w:ascii="Aptos Display" w:eastAsia="Times New Roman" w:hAnsi="Aptos Display" w:cs="Times New Roman"/>
+          <w:sz w:val="24"/>
+          <w:szCs w:val="24"/>
+        </w:rPr>
+      </w:pPr>
+      <w:r>
+        <w:rPr>
+          <w:rFonts w:ascii="Aptos Display" w:eastAsia="Times New Roman" w:hAnsi="Aptos Display" w:cs="Times New Roman"/>
+          <w:sz w:val="24"/>
+          <w:szCs w:val="24"/>
+        </w:rPr>
+        <w:t>Maintained application and database infrastructure supporting thousands of users</w:t>
+      </w:r>
+    </w:p>
+    <w:p>
+      <w:pPr>
+        <w:pStyle w:val="ListParagraph"/>
+        <w:widowControl/>
+        <w:numPr>
+          <w:ilvl w:val="0"/>
+          <w:numId w:val="27"/>
+        </w:numPr>
+        <w:autoSpaceDE/>
+        <w:autoSpaceDN/>
+        <w:ind w:right="680"/>
+        <w:rPr>
+          <w:rFonts w:ascii="Aptos Display" w:eastAsia="Times New Roman" w:hAnsi="Aptos Display" w:cs="Times New Roman"/>
+          <w:sz w:val="24"/>
+          <w:szCs w:val="24"/>
+        </w:rPr>
+      </w:pPr>
+      <w:r>
+        <w:rPr>
+          <w:rFonts w:ascii="Aptos Display" w:eastAsia="Times New Roman" w:hAnsi="Aptos Display" w:cs="Times New Roman"/>
+          <w:sz w:val="24"/>
+          <w:szCs w:val="24"/>
+        </w:rPr>
+        <w:t>Implemented cloud-based infrastructure improvements to enhance system availability and reliability</w:t>
       </w:r>
     </w:p>
     <w:p>
@@ -1944,7 +1471,74 @@
           <w:sz w:val="24"/>
           <w:szCs w:val="24"/>
         </w:rPr>
-        <w:t>Migrated systems from legacy platforms to client/server architecture</w:t>
+        <w:t>Diagnosed and resolved production issues across application, database, and infrastructure layers</w:t>
+      </w:r>
+    </w:p>
+    <w:p>
+      <w:pPr>
+        <w:spacing w:before="106"/>
+        <w:ind w:left="360"/>
+        <w:rPr>
+          <w:rFonts w:ascii="Aptos Display" w:hAnsi="Aptos Display"/>
+          <w:b/>
+          <w:bCs/>
+          <w:w w:val="105"/>
+          <w:sz w:val="26"/>
+          <w:szCs w:val="26"/>
+        </w:rPr>
+      </w:pPr>
+      <w:r>
+        <w:rPr>
+          <w:rFonts w:ascii="Aptos Display" w:hAnsi="Aptos Display"/>
+          <w:b/>
+          <w:bCs/>
+          <w:w w:val="105"/>
+          <w:sz w:val="26"/>
+          <w:szCs w:val="26"/>
+        </w:rPr>
+        <w:t>SeeBeyond — Senior Consultant</w:t>
+      </w:r>
+    </w:p>
+    <w:p>
+      <w:pPr>
+        <w:ind w:left="331"/>
+        <w:rPr>
+          <w:rFonts w:ascii="Aptos Display" w:hAnsi="Aptos Display"/>
+          <w:spacing w:val="-4"/>
+          <w:w w:val="105"/>
+          <w:sz w:val="26"/>
+          <w:szCs w:val="26"/>
+        </w:rPr>
+      </w:pPr>
+      <w:r>
+        <w:rPr>
+          <w:rFonts w:ascii="Aptos Display" w:hAnsi="Aptos Display"/>
+          <w:spacing w:val="-4"/>
+          <w:w w:val="105"/>
+          <w:sz w:val="26"/>
+          <w:szCs w:val="26"/>
+        </w:rPr>
+        <w:t xml:space="preserve">Industry / Client Focus: </w:t>
+      </w:r>
+      <w:r>
+        <w:rPr>
+          <w:rFonts w:ascii="Aptos Display" w:hAnsi="Aptos Display"/>
+          <w:spacing w:val="-4"/>
+          <w:w w:val="105"/>
+          <w:sz w:val="26"/>
+          <w:szCs w:val="26"/>
+        </w:rPr>
+        <w:t xml:space="preserve">Software, </w:t>
+      </w:r>
+      <w:r>
+        <w:rPr>
+          <w:rFonts w:ascii="Aptos Display" w:hAnsi="Aptos Display"/>
+          <w:spacing w:val="-4"/>
+          <w:w w:val="105"/>
+          <w:sz w:val="26"/>
+          <w:szCs w:val="26"/>
+        </w:rPr>
+        <w:t>integration platform / iPaaS</w:t>
       </w:r>
     </w:p>
     <w:p>
@@ -1952,11 +1546,9 @@
         <w:keepNext/>
         <w:keepLines/>
         <w:widowControl/>
-        <w:tabs>
-          <w:tab w:val="right" w:pos="10080"/>
-        </w:tabs>
         <w:autoSpaceDE/>
         <w:autoSpaceDN/>
+        <w:spacing w:after="160"/>
         <w:ind w:left="330" w:right="680"/>
         <w:rPr>
           <w:rFonts w:ascii="Aptos Display" w:eastAsia="Times New Roman" w:hAnsi="Aptos Display" w:cs="Times New Roman"/>
@@ -1969,9 +1561,118 @@
           <w:rFonts w:ascii="Aptos Display" w:eastAsia="Times New Roman" w:hAnsi="Aptos Display" w:cs="Times New Roman"/>
           <w:sz w:val="24"/>
           <w:szCs w:val="24"/>
-          <w:u w:val="single"/>
-        </w:rPr>
-        <w:tab/>
+        </w:rPr>
+        <w:t>10/</w:t>
+      </w:r>
+      <w:r>
+        <w:rPr>
+          <w:rFonts w:ascii="Aptos Display" w:eastAsia="Times New Roman" w:hAnsi="Aptos Display" w:cs="Times New Roman"/>
+          <w:sz w:val="24"/>
+          <w:szCs w:val="24"/>
+        </w:rPr>
+        <w:t xml:space="preserve">2002 – </w:t>
+      </w:r>
+      <w:r>
+        <w:rPr>
+          <w:rFonts w:ascii="Aptos Display" w:eastAsia="Times New Roman" w:hAnsi="Aptos Display" w:cs="Times New Roman"/>
+          <w:sz w:val="24"/>
+          <w:szCs w:val="24"/>
+        </w:rPr>
+        <w:t>12/</w:t>
+      </w:r>
+      <w:r>
+        <w:rPr>
+          <w:rFonts w:ascii="Aptos Display" w:eastAsia="Times New Roman" w:hAnsi="Aptos Display" w:cs="Times New Roman"/>
+          <w:sz w:val="24"/>
+          <w:szCs w:val="24"/>
+        </w:rPr>
+        <w:t>200</w:t>
+      </w:r>
+      <w:r>
+        <w:rPr>
+          <w:rFonts w:ascii="Aptos Display" w:eastAsia="Times New Roman" w:hAnsi="Aptos Display" w:cs="Times New Roman"/>
+          <w:sz w:val="24"/>
+          <w:szCs w:val="24"/>
+        </w:rPr>
+        <w:t>3</w:t>
+      </w:r>
+    </w:p>
+    <w:p>
+      <w:pPr>
+        <w:pStyle w:val="ListParagraph"/>
+        <w:widowControl/>
+        <w:numPr>
+          <w:ilvl w:val="0"/>
+          <w:numId w:val="27"/>
+        </w:numPr>
+        <w:autoSpaceDE/>
+        <w:autoSpaceDN/>
+        <w:ind w:right="680"/>
+        <w:rPr>
+          <w:rFonts w:ascii="Aptos Display" w:eastAsia="Times New Roman" w:hAnsi="Aptos Display" w:cs="Times New Roman"/>
+          <w:sz w:val="24"/>
+          <w:szCs w:val="24"/>
+        </w:rPr>
+      </w:pPr>
+      <w:r>
+        <w:rPr>
+          <w:rFonts w:ascii="Aptos Display" w:eastAsia="Times New Roman" w:hAnsi="Aptos Display" w:cs="Times New Roman"/>
+          <w:sz w:val="24"/>
+          <w:szCs w:val="24"/>
+        </w:rPr>
+        <w:t>Supported enterprise integration environments, troubleshooting data flow and system communication issues</w:t>
+      </w:r>
+    </w:p>
+    <w:p>
+      <w:pPr>
+        <w:pStyle w:val="ListParagraph"/>
+        <w:widowControl/>
+        <w:numPr>
+          <w:ilvl w:val="0"/>
+          <w:numId w:val="27"/>
+        </w:numPr>
+        <w:autoSpaceDE/>
+        <w:autoSpaceDN/>
+        <w:ind w:right="680"/>
+        <w:rPr>
+          <w:rFonts w:ascii="Aptos Display" w:eastAsia="Times New Roman" w:hAnsi="Aptos Display" w:cs="Times New Roman"/>
+          <w:sz w:val="24"/>
+          <w:szCs w:val="24"/>
+        </w:rPr>
+      </w:pPr>
+      <w:r>
+        <w:rPr>
+          <w:rFonts w:ascii="Aptos Display" w:eastAsia="Times New Roman" w:hAnsi="Aptos Display" w:cs="Times New Roman"/>
+          <w:sz w:val="24"/>
+          <w:szCs w:val="24"/>
+        </w:rPr>
+        <w:t>Maintained and monitored interfaces across distributed systems to ensure reliable data exchange</w:t>
+      </w:r>
+    </w:p>
+    <w:p>
+      <w:pPr>
+        <w:numPr>
+          <w:ilvl w:val="0"/>
+          <w:numId w:val="26"/>
+        </w:numPr>
+        <w:spacing w:after="160"/>
+        <w:rPr>
+          <w:rFonts w:ascii="Aptos Display" w:hAnsi="Aptos Display" w:cs="Times New Roman"/>
+          <w:bCs/>
+          <w:w w:val="105"/>
+          <w:sz w:val="24"/>
+          <w:szCs w:val="24"/>
+        </w:rPr>
+      </w:pPr>
+      <w:r>
+        <w:rPr>
+          <w:rFonts w:ascii="Aptos Display" w:hAnsi="Aptos Display" w:cs="Times New Roman"/>
+          <w:bCs/>
+          <w:w w:val="105"/>
+          <w:sz w:val="24"/>
+          <w:szCs w:val="24"/>
+        </w:rPr>
+        <w:t>Worked within regulated environments requiring stable and secure system operation</w:t>
       </w:r>
     </w:p>
     <w:p>
@@ -1986,6 +1687,843 @@
           <w:b/>
           <w:bCs/>
           <w:w w:val="105"/>
+          <w:sz w:val="26"/>
+          <w:szCs w:val="26"/>
+        </w:rPr>
+      </w:pPr>
+      <w:r>
+        <w:rPr>
+          <w:rFonts w:ascii="Aptos Display" w:hAnsi="Aptos Display"/>
+          <w:b/>
+          <w:bCs/>
+          <w:w w:val="105"/>
+          <w:sz w:val="26"/>
+          <w:szCs w:val="26"/>
+        </w:rPr>
+        <w:lastRenderedPageBreak/>
+        <w:t>Computer Sciences Corporation — Senior Consultant</w:t>
+      </w:r>
+    </w:p>
+    <w:p>
+      <w:pPr>
+        <w:keepNext/>
+        <w:keepLines/>
+        <w:widowControl/>
+        <w:ind w:left="331"/>
+        <w:rPr>
+          <w:rFonts w:ascii="Aptos Display" w:hAnsi="Aptos Display"/>
+          <w:spacing w:val="-4"/>
+          <w:w w:val="105"/>
+          <w:sz w:val="26"/>
+          <w:szCs w:val="26"/>
+        </w:rPr>
+      </w:pPr>
+      <w:r>
+        <w:rPr>
+          <w:rFonts w:ascii="Aptos Display" w:hAnsi="Aptos Display"/>
+          <w:spacing w:val="-4"/>
+          <w:w w:val="105"/>
+          <w:sz w:val="26"/>
+          <w:szCs w:val="26"/>
+        </w:rPr>
+        <w:t xml:space="preserve">Industry / Client Focus: </w:t>
+      </w:r>
+      <w:r>
+        <w:rPr>
+          <w:rFonts w:ascii="Aptos Display" w:hAnsi="Aptos Display"/>
+          <w:spacing w:val="-4"/>
+          <w:w w:val="105"/>
+          <w:sz w:val="26"/>
+          <w:szCs w:val="26"/>
+        </w:rPr>
+        <w:t>Professional Services</w:t>
+      </w:r>
+    </w:p>
+    <w:p>
+      <w:pPr>
+        <w:keepNext/>
+        <w:keepLines/>
+        <w:widowControl/>
+        <w:autoSpaceDE/>
+        <w:autoSpaceDN/>
+        <w:spacing w:after="160"/>
+        <w:ind w:left="330" w:right="680"/>
+        <w:rPr>
+          <w:rFonts w:ascii="Aptos Display" w:eastAsia="Times New Roman" w:hAnsi="Aptos Display" w:cs="Times New Roman"/>
+          <w:sz w:val="24"/>
+          <w:szCs w:val="24"/>
+        </w:rPr>
+      </w:pPr>
+      <w:r>
+        <w:rPr>
+          <w:rFonts w:ascii="Aptos Display" w:eastAsia="Times New Roman" w:hAnsi="Aptos Display" w:cs="Times New Roman"/>
+          <w:sz w:val="24"/>
+          <w:szCs w:val="24"/>
+        </w:rPr>
+        <w:t>10/</w:t>
+      </w:r>
+      <w:r>
+        <w:rPr>
+          <w:rFonts w:ascii="Aptos Display" w:eastAsia="Times New Roman" w:hAnsi="Aptos Display" w:cs="Times New Roman"/>
+          <w:sz w:val="24"/>
+          <w:szCs w:val="24"/>
+        </w:rPr>
+        <w:t xml:space="preserve">2001 – </w:t>
+      </w:r>
+      <w:r>
+        <w:rPr>
+          <w:rFonts w:ascii="Aptos Display" w:eastAsia="Times New Roman" w:hAnsi="Aptos Display" w:cs="Times New Roman"/>
+          <w:sz w:val="24"/>
+          <w:szCs w:val="24"/>
+        </w:rPr>
+        <w:t>10/</w:t>
+      </w:r>
+      <w:r>
+        <w:rPr>
+          <w:rFonts w:ascii="Aptos Display" w:eastAsia="Times New Roman" w:hAnsi="Aptos Display" w:cs="Times New Roman"/>
+          <w:sz w:val="24"/>
+          <w:szCs w:val="24"/>
+        </w:rPr>
+        <w:t>2002</w:t>
+      </w:r>
+    </w:p>
+    <w:p>
+      <w:pPr>
+        <w:pStyle w:val="ListParagraph"/>
+        <w:keepNext/>
+        <w:keepLines/>
+        <w:widowControl/>
+        <w:numPr>
+          <w:ilvl w:val="0"/>
+          <w:numId w:val="27"/>
+        </w:numPr>
+        <w:autoSpaceDE/>
+        <w:autoSpaceDN/>
+        <w:ind w:right="680"/>
+        <w:rPr>
+          <w:rFonts w:ascii="Aptos Display" w:eastAsia="Times New Roman" w:hAnsi="Aptos Display" w:cs="Times New Roman"/>
+          <w:sz w:val="24"/>
+          <w:szCs w:val="24"/>
+        </w:rPr>
+      </w:pPr>
+      <w:r>
+        <w:rPr>
+          <w:rFonts w:ascii="Aptos Display" w:eastAsia="Times New Roman" w:hAnsi="Aptos Display" w:cs="Times New Roman"/>
+          <w:sz w:val="24"/>
+          <w:szCs w:val="24"/>
+        </w:rPr>
+        <w:t>Supported enterprise integration systems and assisted in resolving system connectivity and data exchange issues</w:t>
+      </w:r>
+    </w:p>
+    <w:p>
+      <w:pPr>
+        <w:numPr>
+          <w:ilvl w:val="0"/>
+          <w:numId w:val="26"/>
+        </w:numPr>
+        <w:spacing w:after="160"/>
+        <w:rPr>
+          <w:rFonts w:ascii="Aptos Display" w:hAnsi="Aptos Display" w:cs="Times New Roman"/>
+          <w:bCs/>
+          <w:w w:val="105"/>
+          <w:sz w:val="24"/>
+          <w:szCs w:val="24"/>
+        </w:rPr>
+      </w:pPr>
+      <w:r>
+        <w:rPr>
+          <w:rFonts w:ascii="Aptos Display" w:hAnsi="Aptos Display" w:cs="Times New Roman"/>
+          <w:bCs/>
+          <w:w w:val="105"/>
+          <w:sz w:val="24"/>
+          <w:szCs w:val="24"/>
+        </w:rPr>
+        <w:t xml:space="preserve">Developed and maintained </w:t>
+      </w:r>
+      <w:r>
+        <w:rPr>
+          <w:rFonts w:ascii="Aptos Display" w:hAnsi="Aptos Display" w:cs="Times New Roman"/>
+          <w:bCs/>
+          <w:w w:val="105"/>
+          <w:sz w:val="24"/>
+          <w:szCs w:val="24"/>
+        </w:rPr>
+        <w:t>integration services</w:t>
+      </w:r>
+      <w:r>
+        <w:rPr>
+          <w:rFonts w:ascii="Aptos Display" w:hAnsi="Aptos Display" w:cs="Times New Roman"/>
+          <w:bCs/>
+          <w:w w:val="105"/>
+          <w:sz w:val="24"/>
+          <w:szCs w:val="24"/>
+        </w:rPr>
+        <w:t xml:space="preserve"> components supporting large-scale environments</w:t>
+      </w:r>
+    </w:p>
+    <w:p>
+      <w:pPr>
+        <w:spacing w:before="106"/>
+        <w:ind w:left="360"/>
+        <w:rPr>
+          <w:rFonts w:ascii="Aptos Display" w:hAnsi="Aptos Display"/>
+          <w:b/>
+          <w:bCs/>
+          <w:w w:val="105"/>
+          <w:sz w:val="26"/>
+          <w:szCs w:val="26"/>
+        </w:rPr>
+      </w:pPr>
+      <w:r>
+        <w:rPr>
+          <w:rFonts w:ascii="Aptos Display" w:hAnsi="Aptos Display"/>
+          <w:b/>
+          <w:bCs/>
+          <w:w w:val="105"/>
+          <w:sz w:val="26"/>
+          <w:szCs w:val="26"/>
+        </w:rPr>
+        <w:t xml:space="preserve">Fluor Corporation — </w:t>
+      </w:r>
+      <w:r>
+        <w:rPr>
+          <w:rFonts w:ascii="Aptos Display" w:hAnsi="Aptos Display"/>
+          <w:b/>
+          <w:bCs/>
+          <w:w w:val="105"/>
+          <w:sz w:val="26"/>
+          <w:szCs w:val="26"/>
+        </w:rPr>
+        <w:t>Enterprise Integration Team Lead</w:t>
+      </w:r>
+    </w:p>
+    <w:p>
+      <w:pPr>
+        <w:ind w:left="331"/>
+        <w:rPr>
+          <w:rFonts w:ascii="Aptos Display" w:hAnsi="Aptos Display"/>
+          <w:spacing w:val="-4"/>
+          <w:w w:val="105"/>
+          <w:sz w:val="26"/>
+          <w:szCs w:val="26"/>
+        </w:rPr>
+      </w:pPr>
+      <w:r>
+        <w:rPr>
+          <w:rFonts w:ascii="Aptos Display" w:hAnsi="Aptos Display"/>
+          <w:spacing w:val="-4"/>
+          <w:w w:val="105"/>
+          <w:sz w:val="26"/>
+          <w:szCs w:val="26"/>
+        </w:rPr>
+        <w:t xml:space="preserve">Industry / Client Focus: </w:t>
+      </w:r>
+      <w:r>
+        <w:rPr>
+          <w:rFonts w:ascii="Aptos Display" w:hAnsi="Aptos Display"/>
+          <w:spacing w:val="-4"/>
+          <w:w w:val="105"/>
+          <w:sz w:val="26"/>
+          <w:szCs w:val="26"/>
+        </w:rPr>
+        <w:t>Engineering, procurement, and construction, large scale projects</w:t>
+      </w:r>
+    </w:p>
+    <w:p>
+      <w:pPr>
+        <w:keepNext/>
+        <w:keepLines/>
+        <w:widowControl/>
+        <w:autoSpaceDE/>
+        <w:autoSpaceDN/>
+        <w:spacing w:after="160"/>
+        <w:ind w:left="330" w:right="680"/>
+        <w:rPr>
+          <w:rFonts w:ascii="Aptos Display" w:eastAsia="Times New Roman" w:hAnsi="Aptos Display" w:cs="Times New Roman"/>
+          <w:sz w:val="24"/>
+          <w:szCs w:val="24"/>
+        </w:rPr>
+      </w:pPr>
+      <w:r>
+        <w:rPr>
+          <w:rFonts w:ascii="Aptos Display" w:eastAsia="Times New Roman" w:hAnsi="Aptos Display" w:cs="Times New Roman"/>
+          <w:sz w:val="24"/>
+          <w:szCs w:val="24"/>
+        </w:rPr>
+        <w:t>01/</w:t>
+      </w:r>
+      <w:r>
+        <w:rPr>
+          <w:rFonts w:ascii="Aptos Display" w:eastAsia="Times New Roman" w:hAnsi="Aptos Display" w:cs="Times New Roman"/>
+          <w:sz w:val="24"/>
+          <w:szCs w:val="24"/>
+        </w:rPr>
+        <w:t xml:space="preserve">1999 – </w:t>
+      </w:r>
+      <w:r>
+        <w:rPr>
+          <w:rFonts w:ascii="Aptos Display" w:eastAsia="Times New Roman" w:hAnsi="Aptos Display" w:cs="Times New Roman"/>
+          <w:sz w:val="24"/>
+          <w:szCs w:val="24"/>
+        </w:rPr>
+        <w:t>10/</w:t>
+      </w:r>
+      <w:r>
+        <w:rPr>
+          <w:rFonts w:ascii="Aptos Display" w:eastAsia="Times New Roman" w:hAnsi="Aptos Display" w:cs="Times New Roman"/>
+          <w:sz w:val="24"/>
+          <w:szCs w:val="24"/>
+        </w:rPr>
+        <w:t>2001</w:t>
+      </w:r>
+    </w:p>
+    <w:p>
+      <w:pPr>
+        <w:pStyle w:val="ListParagraph"/>
+        <w:widowControl/>
+        <w:numPr>
+          <w:ilvl w:val="0"/>
+          <w:numId w:val="27"/>
+        </w:numPr>
+        <w:autoSpaceDE/>
+        <w:autoSpaceDN/>
+        <w:ind w:right="680"/>
+        <w:rPr>
+          <w:rFonts w:ascii="Aptos Display" w:eastAsia="Times New Roman" w:hAnsi="Aptos Display" w:cs="Times New Roman"/>
+          <w:sz w:val="24"/>
+          <w:szCs w:val="24"/>
+        </w:rPr>
+      </w:pPr>
+      <w:r>
+        <w:rPr>
+          <w:rFonts w:ascii="Aptos Display" w:eastAsia="Times New Roman" w:hAnsi="Aptos Display" w:cs="Times New Roman"/>
+          <w:sz w:val="24"/>
+          <w:szCs w:val="24"/>
+        </w:rPr>
+        <w:t xml:space="preserve">Supported </w:t>
+      </w:r>
+      <w:r>
+        <w:rPr>
+          <w:rFonts w:ascii="Aptos Display" w:eastAsia="Times New Roman" w:hAnsi="Aptos Display" w:cs="Times New Roman"/>
+          <w:sz w:val="24"/>
+          <w:szCs w:val="24"/>
+        </w:rPr>
+        <w:t>enterprise messaging and integration</w:t>
+      </w:r>
+      <w:r>
+        <w:rPr>
+          <w:rFonts w:ascii="Aptos Display" w:eastAsia="Times New Roman" w:hAnsi="Aptos Display" w:cs="Times New Roman"/>
+          <w:sz w:val="24"/>
+          <w:szCs w:val="24"/>
+        </w:rPr>
+        <w:t xml:space="preserve"> and integration infrastructure</w:t>
+      </w:r>
+    </w:p>
+    <w:p>
+      <w:pPr>
+        <w:pStyle w:val="ListParagraph"/>
+        <w:widowControl/>
+        <w:numPr>
+          <w:ilvl w:val="0"/>
+          <w:numId w:val="27"/>
+        </w:numPr>
+        <w:autoSpaceDE/>
+        <w:autoSpaceDN/>
+        <w:ind w:right="680"/>
+        <w:rPr>
+          <w:rFonts w:ascii="Aptos Display" w:eastAsia="Times New Roman" w:hAnsi="Aptos Display" w:cs="Times New Roman"/>
+          <w:sz w:val="24"/>
+          <w:szCs w:val="24"/>
+        </w:rPr>
+      </w:pPr>
+      <w:r>
+        <w:rPr>
+          <w:rFonts w:ascii="Aptos Display" w:eastAsia="Times New Roman" w:hAnsi="Aptos Display" w:cs="Times New Roman"/>
+          <w:sz w:val="24"/>
+          <w:szCs w:val="24"/>
+        </w:rPr>
+        <w:t>Conducted troubleshooting and validation of system communication across platforms</w:t>
+      </w:r>
+    </w:p>
+    <w:p>
+      <w:pPr>
+        <w:numPr>
+          <w:ilvl w:val="0"/>
+          <w:numId w:val="26"/>
+        </w:numPr>
+        <w:spacing w:after="160"/>
+        <w:rPr>
+          <w:rFonts w:ascii="Aptos Display" w:hAnsi="Aptos Display" w:cs="Times New Roman"/>
+          <w:bCs/>
+          <w:w w:val="105"/>
+          <w:sz w:val="24"/>
+          <w:szCs w:val="24"/>
+        </w:rPr>
+      </w:pPr>
+      <w:r>
+        <w:rPr>
+          <w:rFonts w:ascii="Aptos Display" w:hAnsi="Aptos Display" w:cs="Times New Roman"/>
+          <w:bCs/>
+          <w:w w:val="105"/>
+          <w:sz w:val="24"/>
+          <w:szCs w:val="24"/>
+        </w:rPr>
+        <w:t>Assisted with infrastructure transitions during legacy-to-SAP migrations</w:t>
+      </w:r>
+    </w:p>
+    <w:p>
+      <w:pPr>
+        <w:keepNext/>
+        <w:keepLines/>
+        <w:widowControl/>
+        <w:spacing w:before="106"/>
+        <w:ind w:left="360"/>
+        <w:rPr>
+          <w:rFonts w:ascii="Aptos Display" w:hAnsi="Aptos Display"/>
+          <w:b/>
+          <w:bCs/>
+          <w:w w:val="105"/>
+          <w:sz w:val="26"/>
+          <w:szCs w:val="26"/>
+        </w:rPr>
+      </w:pPr>
+      <w:r>
+        <w:rPr>
+          <w:rFonts w:ascii="Aptos Display" w:hAnsi="Aptos Display"/>
+          <w:b/>
+          <w:bCs/>
+          <w:w w:val="105"/>
+          <w:sz w:val="26"/>
+          <w:szCs w:val="26"/>
+        </w:rPr>
+        <w:t>PM Realty Group — MIS Manager</w:t>
+      </w:r>
+    </w:p>
+    <w:p>
+      <w:pPr>
+        <w:keepNext/>
+        <w:keepLines/>
+        <w:widowControl/>
+        <w:ind w:left="331"/>
+        <w:rPr>
+          <w:rFonts w:ascii="Aptos Display" w:hAnsi="Aptos Display"/>
+          <w:spacing w:val="-4"/>
+          <w:w w:val="105"/>
+          <w:sz w:val="26"/>
+          <w:szCs w:val="26"/>
+        </w:rPr>
+      </w:pPr>
+      <w:r>
+        <w:rPr>
+          <w:rFonts w:ascii="Aptos Display" w:hAnsi="Aptos Display"/>
+          <w:spacing w:val="-4"/>
+          <w:w w:val="105"/>
+          <w:sz w:val="26"/>
+          <w:szCs w:val="26"/>
+        </w:rPr>
+        <w:t xml:space="preserve">Industry / Client Focus: </w:t>
+      </w:r>
+      <w:r>
+        <w:rPr>
+          <w:rFonts w:ascii="Aptos Display" w:hAnsi="Aptos Display"/>
+          <w:spacing w:val="-4"/>
+          <w:w w:val="105"/>
+          <w:sz w:val="26"/>
+          <w:szCs w:val="26"/>
+        </w:rPr>
+        <w:t>Asset management, real estate</w:t>
+      </w:r>
+    </w:p>
+    <w:p>
+      <w:pPr>
+        <w:keepNext/>
+        <w:keepLines/>
+        <w:widowControl/>
+        <w:autoSpaceDE/>
+        <w:autoSpaceDN/>
+        <w:spacing w:after="160"/>
+        <w:ind w:left="330" w:right="680"/>
+        <w:rPr>
+          <w:rFonts w:ascii="Aptos Display" w:eastAsia="Times New Roman" w:hAnsi="Aptos Display" w:cs="Times New Roman"/>
+          <w:sz w:val="24"/>
+          <w:szCs w:val="24"/>
+        </w:rPr>
+      </w:pPr>
+      <w:r>
+        <w:rPr>
+          <w:rFonts w:ascii="Aptos Display" w:eastAsia="Times New Roman" w:hAnsi="Aptos Display" w:cs="Times New Roman"/>
+          <w:sz w:val="24"/>
+          <w:szCs w:val="24"/>
+        </w:rPr>
+        <w:t>01/</w:t>
+      </w:r>
+      <w:r>
+        <w:rPr>
+          <w:rFonts w:ascii="Aptos Display" w:eastAsia="Times New Roman" w:hAnsi="Aptos Display" w:cs="Times New Roman"/>
+          <w:sz w:val="24"/>
+          <w:szCs w:val="24"/>
+        </w:rPr>
+        <w:t xml:space="preserve">1996 – </w:t>
+      </w:r>
+      <w:r>
+        <w:rPr>
+          <w:rFonts w:ascii="Aptos Display" w:eastAsia="Times New Roman" w:hAnsi="Aptos Display" w:cs="Times New Roman"/>
+          <w:sz w:val="24"/>
+          <w:szCs w:val="24"/>
+        </w:rPr>
+        <w:t>01/</w:t>
+      </w:r>
+      <w:r>
+        <w:rPr>
+          <w:rFonts w:ascii="Aptos Display" w:eastAsia="Times New Roman" w:hAnsi="Aptos Display" w:cs="Times New Roman"/>
+          <w:sz w:val="24"/>
+          <w:szCs w:val="24"/>
+        </w:rPr>
+        <w:t>1999</w:t>
+      </w:r>
+    </w:p>
+    <w:p>
+      <w:pPr>
+        <w:pStyle w:val="ListParagraph"/>
+        <w:keepNext/>
+        <w:keepLines/>
+        <w:widowControl/>
+        <w:numPr>
+          <w:ilvl w:val="0"/>
+          <w:numId w:val="27"/>
+        </w:numPr>
+        <w:autoSpaceDE/>
+        <w:autoSpaceDN/>
+        <w:ind w:right="680"/>
+        <w:rPr>
+          <w:rFonts w:ascii="Aptos Display" w:eastAsia="Times New Roman" w:hAnsi="Aptos Display" w:cs="Times New Roman"/>
+          <w:sz w:val="24"/>
+          <w:szCs w:val="24"/>
+        </w:rPr>
+      </w:pPr>
+      <w:r>
+        <w:rPr>
+          <w:rFonts w:ascii="Aptos Display" w:eastAsia="Times New Roman" w:hAnsi="Aptos Display" w:cs="Times New Roman"/>
+          <w:sz w:val="24"/>
+          <w:szCs w:val="24"/>
+        </w:rPr>
+        <w:t xml:space="preserve">Managed IT operations, including </w:t>
+      </w:r>
+      <w:r>
+        <w:rPr>
+          <w:rFonts w:ascii="Aptos Display" w:eastAsia="Times New Roman" w:hAnsi="Aptos Display" w:cs="Times New Roman"/>
+          <w:sz w:val="24"/>
+          <w:szCs w:val="24"/>
+        </w:rPr>
+        <w:t>IT infrastructure</w:t>
+      </w:r>
+      <w:r>
+        <w:rPr>
+          <w:rFonts w:ascii="Aptos Display" w:eastAsia="Times New Roman" w:hAnsi="Aptos Display" w:cs="Times New Roman"/>
+          <w:sz w:val="24"/>
+          <w:szCs w:val="24"/>
+        </w:rPr>
+        <w:t>, system connectivity, and user support</w:t>
+      </w:r>
+    </w:p>
+    <w:p>
+      <w:pPr>
+        <w:pStyle w:val="ListParagraph"/>
+        <w:widowControl/>
+        <w:numPr>
+          <w:ilvl w:val="0"/>
+          <w:numId w:val="27"/>
+        </w:numPr>
+        <w:autoSpaceDE/>
+        <w:autoSpaceDN/>
+        <w:ind w:right="680"/>
+        <w:rPr>
+          <w:rFonts w:ascii="Aptos Display" w:eastAsia="Times New Roman" w:hAnsi="Aptos Display" w:cs="Times New Roman"/>
+          <w:sz w:val="24"/>
+          <w:szCs w:val="24"/>
+        </w:rPr>
+      </w:pPr>
+      <w:r>
+        <w:rPr>
+          <w:rFonts w:ascii="Aptos Display" w:eastAsia="Times New Roman" w:hAnsi="Aptos Display" w:cs="Times New Roman"/>
+          <w:sz w:val="24"/>
+          <w:szCs w:val="24"/>
+        </w:rPr>
+        <w:t>Led LAN/WAN upgrades and ensured reliable communication across office locations</w:t>
+      </w:r>
+    </w:p>
+    <w:p>
+      <w:pPr>
+        <w:numPr>
+          <w:ilvl w:val="0"/>
+          <w:numId w:val="26"/>
+        </w:numPr>
+        <w:spacing w:after="160"/>
+        <w:rPr>
+          <w:rFonts w:ascii="Aptos Display" w:hAnsi="Aptos Display" w:cs="Times New Roman"/>
+          <w:bCs/>
+          <w:w w:val="105"/>
+          <w:sz w:val="24"/>
+          <w:szCs w:val="24"/>
+        </w:rPr>
+      </w:pPr>
+      <w:r>
+        <w:rPr>
+          <w:rFonts w:ascii="Aptos Display" w:hAnsi="Aptos Display" w:cs="Times New Roman"/>
+          <w:bCs/>
+          <w:w w:val="105"/>
+          <w:sz w:val="24"/>
+          <w:szCs w:val="24"/>
+        </w:rPr>
+        <w:t>Supported business-critical systems and provided hands-on technical troubleshooting</w:t>
+      </w:r>
+    </w:p>
+    <w:p>
+      <w:pPr>
+        <w:spacing w:before="106"/>
+        <w:ind w:left="360"/>
+        <w:rPr>
+          <w:rFonts w:ascii="Aptos Display" w:hAnsi="Aptos Display"/>
+          <w:b/>
+          <w:bCs/>
+          <w:w w:val="105"/>
+          <w:sz w:val="26"/>
+          <w:szCs w:val="26"/>
+        </w:rPr>
+      </w:pPr>
+      <w:r>
+        <w:rPr>
+          <w:rFonts w:ascii="Aptos Display" w:hAnsi="Aptos Display"/>
+          <w:b/>
+          <w:bCs/>
+          <w:w w:val="105"/>
+          <w:sz w:val="26"/>
+          <w:szCs w:val="26"/>
+        </w:rPr>
+        <w:t>Access Development Corp — System Administrator / Programmer</w:t>
+      </w:r>
+    </w:p>
+    <w:p>
+      <w:pPr>
+        <w:ind w:left="331"/>
+        <w:rPr>
+          <w:rFonts w:ascii="Aptos Display" w:hAnsi="Aptos Display"/>
+          <w:spacing w:val="-4"/>
+          <w:w w:val="105"/>
+          <w:sz w:val="26"/>
+          <w:szCs w:val="26"/>
+        </w:rPr>
+      </w:pPr>
+      <w:r>
+        <w:rPr>
+          <w:rFonts w:ascii="Aptos Display" w:hAnsi="Aptos Display"/>
+          <w:spacing w:val="-4"/>
+          <w:w w:val="105"/>
+          <w:sz w:val="26"/>
+          <w:szCs w:val="26"/>
+        </w:rPr>
+        <w:t xml:space="preserve">Industry / Client Focus: </w:t>
+      </w:r>
+      <w:r>
+        <w:rPr>
+          <w:rFonts w:ascii="Aptos Display" w:hAnsi="Aptos Display"/>
+          <w:spacing w:val="-4"/>
+          <w:w w:val="105"/>
+          <w:sz w:val="26"/>
+          <w:szCs w:val="26"/>
+        </w:rPr>
+        <w:t>Travel and merchandise discount platform</w:t>
+      </w:r>
+    </w:p>
+    <w:p>
+      <w:pPr>
+        <w:widowControl/>
+        <w:autoSpaceDE/>
+        <w:autoSpaceDN/>
+        <w:spacing w:after="160"/>
+        <w:ind w:left="330" w:right="680"/>
+        <w:rPr>
+          <w:rFonts w:ascii="Aptos Display" w:eastAsia="Times New Roman" w:hAnsi="Aptos Display" w:cs="Times New Roman"/>
+          <w:sz w:val="24"/>
+          <w:szCs w:val="24"/>
+        </w:rPr>
+      </w:pPr>
+      <w:r>
+        <w:rPr>
+          <w:rFonts w:ascii="Aptos Display" w:eastAsia="Times New Roman" w:hAnsi="Aptos Display" w:cs="Times New Roman"/>
+          <w:sz w:val="24"/>
+          <w:szCs w:val="24"/>
+        </w:rPr>
+        <w:t>05/</w:t>
+      </w:r>
+      <w:r>
+        <w:rPr>
+          <w:rFonts w:ascii="Aptos Display" w:eastAsia="Times New Roman" w:hAnsi="Aptos Display" w:cs="Times New Roman"/>
+          <w:sz w:val="24"/>
+          <w:szCs w:val="24"/>
+        </w:rPr>
+        <w:t xml:space="preserve">1986 – </w:t>
+      </w:r>
+      <w:r>
+        <w:rPr>
+          <w:rFonts w:ascii="Aptos Display" w:eastAsia="Times New Roman" w:hAnsi="Aptos Display" w:cs="Times New Roman"/>
+          <w:sz w:val="24"/>
+          <w:szCs w:val="24"/>
+        </w:rPr>
+        <w:t>01/</w:t>
+      </w:r>
+      <w:r>
+        <w:rPr>
+          <w:rFonts w:ascii="Aptos Display" w:eastAsia="Times New Roman" w:hAnsi="Aptos Display" w:cs="Times New Roman"/>
+          <w:sz w:val="24"/>
+          <w:szCs w:val="24"/>
+        </w:rPr>
+        <w:t>1996</w:t>
+      </w:r>
+    </w:p>
+    <w:p>
+      <w:pPr>
+        <w:pStyle w:val="ListParagraph"/>
+        <w:widowControl/>
+        <w:numPr>
+          <w:ilvl w:val="0"/>
+          <w:numId w:val="27"/>
+        </w:numPr>
+        <w:autoSpaceDE/>
+        <w:autoSpaceDN/>
+        <w:ind w:right="680"/>
+        <w:rPr>
+          <w:rFonts w:ascii="Aptos Display" w:eastAsia="Times New Roman" w:hAnsi="Aptos Display" w:cs="Times New Roman"/>
+          <w:sz w:val="24"/>
+          <w:szCs w:val="24"/>
+        </w:rPr>
+      </w:pPr>
+      <w:r>
+        <w:rPr>
+          <w:rFonts w:ascii="Aptos Display" w:eastAsia="Times New Roman" w:hAnsi="Aptos Display" w:cs="Times New Roman"/>
+          <w:sz w:val="24"/>
+          <w:szCs w:val="24"/>
+        </w:rPr>
+        <w:t xml:space="preserve">Administered </w:t>
+      </w:r>
+      <w:r>
+        <w:rPr>
+          <w:rFonts w:ascii="Aptos Display" w:eastAsia="Times New Roman" w:hAnsi="Aptos Display" w:cs="Times New Roman"/>
+          <w:sz w:val="24"/>
+          <w:szCs w:val="24"/>
+        </w:rPr>
+        <w:t>Client/server and LAN-based systems</w:t>
+      </w:r>
+      <w:r>
+        <w:rPr>
+          <w:rFonts w:ascii="Aptos Display" w:eastAsia="Times New Roman" w:hAnsi="Aptos Display" w:cs="Times New Roman"/>
+          <w:sz w:val="24"/>
+          <w:szCs w:val="24"/>
+        </w:rPr>
+        <w:t xml:space="preserve"> and supported internal users with hardware and software issues</w:t>
+      </w:r>
+    </w:p>
+    <w:p>
+      <w:pPr>
+        <w:pStyle w:val="ListParagraph"/>
+        <w:widowControl/>
+        <w:numPr>
+          <w:ilvl w:val="0"/>
+          <w:numId w:val="27"/>
+        </w:numPr>
+        <w:autoSpaceDE/>
+        <w:autoSpaceDN/>
+        <w:ind w:right="680"/>
+        <w:rPr>
+          <w:rFonts w:ascii="Aptos Display" w:eastAsia="Times New Roman" w:hAnsi="Aptos Display" w:cs="Times New Roman"/>
+          <w:sz w:val="24"/>
+          <w:szCs w:val="24"/>
+        </w:rPr>
+      </w:pPr>
+      <w:r>
+        <w:rPr>
+          <w:rFonts w:ascii="Aptos Display" w:eastAsia="Times New Roman" w:hAnsi="Aptos Display" w:cs="Times New Roman"/>
+          <w:sz w:val="24"/>
+          <w:szCs w:val="24"/>
+        </w:rPr>
+        <w:t>Installed, configured, and maintained business applications and system environments</w:t>
+      </w:r>
+    </w:p>
+    <w:p>
+      <w:pPr>
+        <w:numPr>
+          <w:ilvl w:val="0"/>
+          <w:numId w:val="26"/>
+        </w:numPr>
+        <w:spacing w:after="160"/>
+        <w:rPr>
+          <w:rFonts w:ascii="Aptos Display" w:hAnsi="Aptos Display" w:cs="Times New Roman"/>
+          <w:bCs/>
+          <w:w w:val="105"/>
+          <w:sz w:val="24"/>
+          <w:szCs w:val="24"/>
+        </w:rPr>
+      </w:pPr>
+      <w:r>
+        <w:rPr>
+          <w:rFonts w:ascii="Aptos Display" w:hAnsi="Aptos Display" w:cs="Times New Roman"/>
+          <w:bCs/>
+          <w:w w:val="105"/>
+          <w:sz w:val="24"/>
+          <w:szCs w:val="24"/>
+        </w:rPr>
+        <w:t xml:space="preserve">Migrated systems from legacy platforms to </w:t>
+      </w:r>
+      <w:r>
+        <w:rPr>
+          <w:rFonts w:ascii="Aptos Display" w:hAnsi="Aptos Display" w:cs="Times New Roman"/>
+          <w:bCs/>
+          <w:w w:val="105"/>
+          <w:sz w:val="24"/>
+          <w:szCs w:val="24"/>
+        </w:rPr>
+        <w:t>client/server and LAN-based systems</w:t>
+      </w:r>
+    </w:p>
+    <w:p>
+      <w:pPr>
+        <w:keepNext/>
+        <w:keepLines/>
+        <w:widowControl/>
+        <w:tabs>
+          <w:tab w:val="right" w:pos="10080"/>
+        </w:tabs>
+        <w:autoSpaceDE/>
+        <w:autoSpaceDN/>
+        <w:ind w:left="330" w:right="680"/>
+        <w:rPr>
+          <w:rFonts w:ascii="Aptos Display" w:eastAsia="Times New Roman" w:hAnsi="Aptos Display" w:cs="Times New Roman"/>
+          <w:sz w:val="24"/>
+          <w:szCs w:val="24"/>
+        </w:rPr>
+      </w:pPr>
+      <w:r>
+        <w:rPr>
+          <w:rFonts w:ascii="Aptos Display" w:eastAsia="Times New Roman" w:hAnsi="Aptos Display" w:cs="Times New Roman"/>
+          <w:sz w:val="24"/>
+          <w:szCs w:val="24"/>
+          <w:u w:val="single"/>
+        </w:rPr>
+        <w:tab/>
+      </w:r>
+    </w:p>
+    <w:p>
+      <w:pPr>
+        <w:keepNext/>
+        <w:keepLines/>
+        <w:widowControl/>
+        <w:spacing w:before="106"/>
+        <w:ind w:left="360"/>
+        <w:rPr>
+          <w:rFonts w:ascii="Aptos Display" w:hAnsi="Aptos Display"/>
+          <w:b/>
+          <w:bCs/>
+          <w:w w:val="105"/>
           <w:sz w:val="32"/>
           <w:szCs w:val="32"/>
         </w:rPr>
@@ -2229,7 +2767,29 @@
           <w:sz w:val="24"/>
           <w:szCs w:val="24"/>
         </w:rPr>
-        <w:t xml:space="preserve"> Portainer,</w:t>
+        <w:t xml:space="preserve"> </w:t>
+      </w:r>
+      <w:proofErr w:type="spellStart"/>
+      <w:r>
+        <w:rPr>
+          <w:rFonts w:ascii="Aptos Display" w:hAnsi="Aptos Display" w:cs="Times New Roman"/>
+          <w:bCs/>
+          <w:w w:val="105"/>
+          <w:sz w:val="24"/>
+          <w:szCs w:val="24"/>
+        </w:rPr>
+        <w:t>Portainer</w:t>
+      </w:r>
+      <w:proofErr w:type="spellEnd"/>
+      <w:r>
+        <w:rPr>
+          <w:rFonts w:ascii="Aptos Display" w:hAnsi="Aptos Display" w:cs="Times New Roman"/>
+          <w:bCs/>
+          <w:w w:val="105"/>
+          <w:sz w:val="24"/>
+          <w:szCs w:val="24"/>
+        </w:rPr>
+        <w:t>,</w:t>
       </w:r>
       <w:r>
         <w:rPr>
@@ -2263,6 +2823,7 @@
           <w:sz w:val="26"/>
           <w:szCs w:val="26"/>
         </w:rPr>
+        <w:lastRenderedPageBreak/>
         <w:t>Programming/Scripting (support-focused use)</w:t>
       </w:r>
       <w:r>
@@ -2417,151 +2978,241 @@
 <w:ftr xmlns:wpc="http://schemas.microsoft.com/office/word/2010/wordprocessingCanvas" xmlns:cx="http://schemas.microsoft.com/office/drawing/2014/chartex" xmlns:cx1="http://schemas.microsoft.com/office/drawing/2015/9/8/chartex" xmlns:cx2="http://schemas.microsoft.com/office/drawing/2015/10/21/chartex" xmlns:cx3="http://schemas.microsoft.com/office/drawing/2016/5/9/chartex" xmlns:cx4="http://schemas.microsoft.com/office/drawing/2016/5/10/chartex" xmlns:cx5="http://schemas.microsoft.com/office/drawing/2016/5/11/chartex" xmlns:cx6="http://schemas.microsoft.com/office/drawing/2016/5/12/chartex" xmlns:cx7="http://schemas.microsoft.com/office/drawing/2016/5/13/chartex" xmlns:cx8="http://schemas.microsoft.com/office/drawing/2016/5/14/chartex" xmlns:mc="http://schemas.openxmlformats.org/markup-compatibility/2006" xmlns:aink="http://schemas.microsoft.com/office/drawing/2016/ink" xmlns:am3d="http://schemas.microsoft.com/office/drawing/2017/model3d" xmlns:o="urn:schemas-microsoft-com:office:office" xmlns:oel="http://schemas.microsoft.com/office/2019/extlst" xmlns:r="http://schemas.openxmlformats.org/officeDocument/2006/relationships" xmlns:m="http://schemas.openxmlformats.org/officeDocument/2006/math" xmlns:v="urn:schemas-microsoft-com:vml" xmlns:wp14="http://schemas.microsoft.com/office/word/2010/wordprocessingDrawing" xmlns:wp="http://schemas.openxmlformats.org/drawingml/2006/wordprocessingDrawing" xmlns:w10="urn:schemas-microsoft-com:office:word" xmlns:w="http://schemas.openxmlformats.org/wordprocessingml/2006/main" xmlns:w14="http://schemas.microsoft.com/office/word/2010/wordml" xmlns:w15="http://schemas.microsoft.com/office/word/2012/wordml" xmlns:w16cex="http://schemas.microsoft.com/office/word/2018/wordml/cex" xmlns:w16cid="http://schemas.microsoft.com/office/word/2016/wordml/cid" xmlns:w16="http://schemas.microsoft.com/office/word/2018/wordml" xmlns:w16du="http://schemas.microsoft.com/office/word/2023/wordml/word16du" xmlns:w16sdtdh="http://schemas.microsoft.com/office/word/2020/wordml/sdtdatahash" xmlns:w16sdtfl="http://schemas.microsoft.com/office/word/2024/wordml/sdtformatlock" xmlns:w16se="http://schemas.microsoft.com/office/word/2015/wordml/symex" xmlns:wpg="http://schemas.microsoft.com/office/word/2010/wordprocessingGroup" xmlns:wpi="http://schemas.microsoft.com/office/word/2010/wordprocessingInk" xmlns:wne="http://schemas.microsoft.com/office/word/2006/wordml" xmlns:wps="http://schemas.microsoft.com/office/word/2010/wordprocessingShape" mc:Ignorable="w14 w15 w16se w16cid w16 w16cex w16sdtdh w16sdtfl w16du wp14">
   <w:p>
     <w:pPr>
-      <w:pStyle w:val="BodyText"/>
-      <w:spacing w:line="14" w:lineRule="auto"/>
-      <w:ind w:left="0"/>
+      <w:pStyle w:val="Footer"/>
+      <w:pBdr>
+        <w:bottom w:val="single" w:sz="6" w:space="1" w:color="auto"/>
+      </w:pBdr>
+      <w:tabs>
+        <w:tab w:val="clear" w:pos="4680"/>
+        <w:tab w:val="clear" w:pos="9360"/>
+        <w:tab w:val="right" w:pos="10560"/>
+      </w:tabs>
+      <w:rPr>
+        <w:rFonts w:ascii="Aptos Display" w:hAnsi="Aptos Display"/>
+      </w:rPr>
+    </w:pPr>
+  </w:p>
+  <w:p>
+    <w:pPr>
+      <w:pStyle w:val="Footer"/>
+      <w:tabs>
+        <w:tab w:val="clear" w:pos="4680"/>
+        <w:tab w:val="clear" w:pos="9360"/>
+        <w:tab w:val="right" w:pos="10780"/>
+      </w:tabs>
+      <w:rPr>
+        <w:rFonts w:ascii="Aptos Display" w:hAnsi="Aptos Display"/>
+      </w:rPr>
     </w:pPr>
     <w:r>
       <w:rPr>
-        <w:noProof/>
-      </w:rPr>
-      <mc:AlternateContent>
-        <mc:Choice Requires="wps">
-          <w:drawing>
-            <wp:anchor distT="0" distB="0" distL="0" distR="0" simplePos="0" relativeHeight="251658240" behindDoc="1" locked="0" layoutInCell="1" allowOverlap="1" wp14:anchorId="60F405D1" wp14:editId="0C900D7A">
-              <wp:simplePos x="0" y="0"/>
-              <wp:positionH relativeFrom="page">
-                <wp:posOffset>3816464</wp:posOffset>
-              </wp:positionH>
-              <wp:positionV relativeFrom="page">
-                <wp:posOffset>9596878</wp:posOffset>
-              </wp:positionV>
-              <wp:extent cx="152400" cy="205104"/>
-              <wp:effectExtent l="0" t="0" r="0" b="0"/>
-              <wp:wrapNone/>
-              <wp:docPr id="1" name="Textbox 1"/>
-              <wp:cNvGraphicFramePr>
-                <a:graphicFrameLocks xmlns:a="http://schemas.openxmlformats.org/drawingml/2006/main"/>
-              </wp:cNvGraphicFramePr>
-              <a:graphic xmlns:a="http://schemas.openxmlformats.org/drawingml/2006/main">
-                <a:graphicData uri="http://schemas.microsoft.com/office/word/2010/wordprocessingShape">
-                  <wps:wsp>
-                    <wps:cNvSpPr txBox="1">
-                      <a:spLocks/>
-                    </wps:cNvSpPr>
-                    <wps:spPr>
-                      <a:xfrm>
-                        <a:off x="0" y="0"/>
-                        <a:ext cx="152400" cy="205104"/>
-                      </a:xfrm>
-                      <a:prstGeom prst="rect">
-                        <a:avLst/>
-                      </a:prstGeom>
-                    </wps:spPr>
-                    <wps:txbx>
-                      <w:txbxContent>
-                        <w:p>
-                          <w:pPr>
-                            <w:pStyle w:val="BodyText"/>
-                            <w:spacing w:before="34"/>
-                            <w:ind w:left="60"/>
-                          </w:pPr>
-                          <w:r>
-                            <w:rPr>
-                              <w:spacing w:val="-10"/>
-                            </w:rPr>
-                            <w:fldChar w:fldCharType="begin"/>
-                          </w:r>
-                          <w:r>
-                            <w:rPr>
-                              <w:spacing w:val="-10"/>
-                            </w:rPr>
-                            <w:instrText xml:space="preserve"> PAGE </w:instrText>
-                          </w:r>
-                          <w:r>
-                            <w:rPr>
-                              <w:spacing w:val="-10"/>
-                            </w:rPr>
-                            <w:fldChar w:fldCharType="separate"/>
-                          </w:r>
-                          <w:r>
-                            <w:rPr>
-                              <w:spacing w:val="-10"/>
-                            </w:rPr>
-                            <w:t>1</w:t>
-                          </w:r>
-                          <w:r>
-                            <w:rPr>
-                              <w:spacing w:val="-10"/>
-                            </w:rPr>
-                            <w:fldChar w:fldCharType="end"/>
-                          </w:r>
-                        </w:p>
-                      </w:txbxContent>
-                    </wps:txbx>
-                    <wps:bodyPr wrap="square" lIns="0" tIns="0" rIns="0" bIns="0" rtlCol="0">
-                      <a:noAutofit/>
-                    </wps:bodyPr>
-                  </wps:wsp>
-                </a:graphicData>
-              </a:graphic>
-            </wp:anchor>
-          </w:drawing>
-        </mc:Choice>
-        <mc:Fallback>
-          <w:pict>
-            <v:shapetype w14:anchorId="60F405D1" id="_x0000_t202" coordsize="21600,21600" o:spt="202" path="m,l,21600r21600,l21600,xe">
-              <v:stroke joinstyle="miter"/>
-              <v:path gradientshapeok="t" o:connecttype="rect"/>
-            </v:shapetype>
-            <v:shape id="Textbox 1" o:spid="_x0000_s1026" type="#_x0000_t202" style="position:absolute;margin-left:300.5pt;margin-top:755.65pt;width:12pt;height:16.15pt;z-index:-251658240;visibility:visible;mso-wrap-style:square;mso-wrap-distance-left:0;mso-wrap-distance-top:0;mso-wrap-distance-right:0;mso-wrap-distance-bottom:0;mso-position-horizontal:absolute;mso-position-horizontal-relative:page;mso-position-vertical:absolute;mso-position-vertical-relative:page;v-text-anchor:top" o:gfxdata="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" filled="f" stroked="f">
-              <v:textbox inset="0,0,0,0">
-                <w:txbxContent>
-                  <w:p>
-                    <w:pPr>
-                      <w:pStyle w:val="BodyText"/>
-                      <w:spacing w:before="34"/>
-                      <w:ind w:left="60"/>
-                    </w:pPr>
-                    <w:r>
-                      <w:rPr>
-                        <w:spacing w:val="-10"/>
-                      </w:rPr>
-                      <w:fldChar w:fldCharType="begin"/>
-                    </w:r>
-                    <w:r>
-                      <w:rPr>
-                        <w:spacing w:val="-10"/>
-                      </w:rPr>
-                      <w:instrText xml:space="preserve"> PAGE </w:instrText>
-                    </w:r>
-                    <w:r>
-                      <w:rPr>
-                        <w:spacing w:val="-10"/>
-                      </w:rPr>
-                      <w:fldChar w:fldCharType="separate"/>
-                    </w:r>
-                    <w:r>
-                      <w:rPr>
-                        <w:spacing w:val="-10"/>
-                      </w:rPr>
-                      <w:t>1</w:t>
-                    </w:r>
-                    <w:r>
-                      <w:rPr>
-                        <w:spacing w:val="-10"/>
-                      </w:rPr>
-                      <w:fldChar w:fldCharType="end"/>
-                    </w:r>
-                  </w:p>
-                </w:txbxContent>
-              </v:textbox>
-              <w10:wrap anchorx="page" anchory="page"/>
-            </v:shape>
-          </w:pict>
-        </mc:Fallback>
-      </mc:AlternateContent>
+        <w:rFonts w:ascii="Aptos Display" w:hAnsi="Aptos Display"/>
+      </w:rPr>
+      <w:t>David Omer •</w:t>
     </w:r>
+    <w:r>
+      <w:rPr>
+        <w:rFonts w:ascii="Aptos Display" w:hAnsi="Aptos Display"/>
+        <w:spacing w:val="46"/>
+      </w:rPr>
+      <w:t xml:space="preserve"> </w:t>
+    </w:r>
+    <w:hyperlink r:id="rId1" w:history="1">
+      <w:r>
+        <w:rPr>
+          <w:rStyle w:val="Hyperlink"/>
+          <w:rFonts w:ascii="Aptos Display" w:hAnsi="Aptos Display"/>
+        </w:rPr>
+        <w:t>capture456@outlook.com</w:t>
+      </w:r>
+    </w:hyperlink>
+    <w:r>
+      <w:rPr>
+        <w:rFonts w:ascii="Aptos Display" w:hAnsi="Aptos Display"/>
+        <w:spacing w:val="47"/>
+      </w:rPr>
+      <w:t xml:space="preserve"> </w:t>
+    </w:r>
+    <w:r>
+      <w:rPr>
+        <w:rFonts w:ascii="Aptos Display" w:hAnsi="Aptos Display"/>
+      </w:rPr>
+      <w:t>•</w:t>
+    </w:r>
+    <w:r>
+      <w:rPr>
+        <w:rFonts w:ascii="Aptos Display" w:hAnsi="Aptos Display"/>
+        <w:spacing w:val="46"/>
+      </w:rPr>
+      <w:t xml:space="preserve"> </w:t>
+    </w:r>
+    <w:r>
+      <w:rPr>
+        <w:rFonts w:ascii="Aptos Display" w:hAnsi="Aptos Display"/>
+      </w:rPr>
+      <w:t>+1</w:t>
+    </w:r>
+    <w:r>
+      <w:rPr>
+        <w:rFonts w:ascii="Aptos Display" w:hAnsi="Aptos Display"/>
+        <w:spacing w:val="-3"/>
+      </w:rPr>
+      <w:t xml:space="preserve"> </w:t>
+    </w:r>
+    <w:r>
+      <w:rPr>
+        <w:rFonts w:ascii="Aptos Display" w:hAnsi="Aptos Display"/>
+      </w:rPr>
+      <w:t>562-833-4552</w:t>
+    </w:r>
+    <w:r>
+      <w:rPr>
+        <w:rFonts w:ascii="Aptos Display" w:hAnsi="Aptos Display"/>
+      </w:rPr>
+      <w:tab/>
+    </w:r>
+    <w:sdt>
+      <w:sdtPr>
+        <w:rPr>
+          <w:rFonts w:ascii="Aptos Display" w:hAnsi="Aptos Display"/>
+        </w:rPr>
+        <w:id w:val="1486276946"/>
+        <w:docPartObj>
+          <w:docPartGallery w:val="Page Numbers (Bottom of Page)"/>
+          <w:docPartUnique/>
+        </w:docPartObj>
+      </w:sdtPr>
+      <w:sdtContent>
+        <w:sdt>
+          <w:sdtPr>
+            <w:rPr>
+              <w:rFonts w:ascii="Aptos Display" w:hAnsi="Aptos Display"/>
+            </w:rPr>
+            <w:id w:val="-1769616900"/>
+            <w:docPartObj>
+              <w:docPartGallery w:val="Page Numbers (Top of Page)"/>
+              <w:docPartUnique/>
+            </w:docPartObj>
+          </w:sdtPr>
+          <w:sdtContent>
+            <w:r>
+              <w:rPr>
+                <w:rFonts w:ascii="Aptos Display" w:hAnsi="Aptos Display"/>
+              </w:rPr>
+              <w:t xml:space="preserve">Page </w:t>
+            </w:r>
+            <w:r>
+              <w:rPr>
+                <w:rFonts w:ascii="Aptos Display" w:hAnsi="Aptos Display"/>
+                <w:b/>
+                <w:bCs/>
+                <w:sz w:val="24"/>
+                <w:szCs w:val="24"/>
+              </w:rPr>
+              <w:fldChar w:fldCharType="begin"/>
+            </w:r>
+            <w:r>
+              <w:rPr>
+                <w:rFonts w:ascii="Aptos Display" w:hAnsi="Aptos Display"/>
+                <w:b/>
+                <w:bCs/>
+              </w:rPr>
+              <w:instrText xml:space="preserve"> PAGE </w:instrText>
+            </w:r>
+            <w:r>
+              <w:rPr>
+                <w:rFonts w:ascii="Aptos Display" w:hAnsi="Aptos Display"/>
+                <w:b/>
+                <w:bCs/>
+                <w:sz w:val="24"/>
+                <w:szCs w:val="24"/>
+              </w:rPr>
+              <w:fldChar w:fldCharType="separate"/>
+            </w:r>
+            <w:r>
+              <w:rPr>
+                <w:rFonts w:ascii="Aptos Display" w:hAnsi="Aptos Display"/>
+                <w:b/>
+                <w:bCs/>
+              </w:rPr>
+              <w:t>1</w:t>
+            </w:r>
+            <w:r>
+              <w:rPr>
+                <w:rFonts w:ascii="Aptos Display" w:hAnsi="Aptos Display"/>
+                <w:b/>
+                <w:bCs/>
+                <w:sz w:val="24"/>
+                <w:szCs w:val="24"/>
+              </w:rPr>
+              <w:fldChar w:fldCharType="end"/>
+            </w:r>
+            <w:r>
+              <w:rPr>
+                <w:rFonts w:ascii="Aptos Display" w:hAnsi="Aptos Display"/>
+              </w:rPr>
+              <w:t xml:space="preserve"> of </w:t>
+            </w:r>
+            <w:r>
+              <w:rPr>
+                <w:rFonts w:ascii="Aptos Display" w:hAnsi="Aptos Display"/>
+                <w:b/>
+                <w:bCs/>
+                <w:sz w:val="24"/>
+                <w:szCs w:val="24"/>
+              </w:rPr>
+              <w:fldChar w:fldCharType="begin"/>
+            </w:r>
+            <w:r>
+              <w:rPr>
+                <w:rFonts w:ascii="Aptos Display" w:hAnsi="Aptos Display"/>
+                <w:b/>
+                <w:bCs/>
+              </w:rPr>
+              <w:instrText xml:space="preserve"> NUMPAGES  </w:instrText>
+            </w:r>
+            <w:r>
+              <w:rPr>
+                <w:rFonts w:ascii="Aptos Display" w:hAnsi="Aptos Display"/>
+                <w:b/>
+                <w:bCs/>
+                <w:sz w:val="24"/>
+                <w:szCs w:val="24"/>
+              </w:rPr>
+              <w:fldChar w:fldCharType="separate"/>
+            </w:r>
+            <w:r>
+              <w:rPr>
+                <w:rFonts w:ascii="Aptos Display" w:hAnsi="Aptos Display"/>
+                <w:b/>
+                <w:bCs/>
+              </w:rPr>
+              <w:t>4</w:t>
+            </w:r>
+            <w:r>
+              <w:rPr>
+                <w:rFonts w:ascii="Aptos Display" w:hAnsi="Aptos Display"/>
+                <w:b/>
+                <w:bCs/>
+                <w:sz w:val="24"/>
+                <w:szCs w:val="24"/>
+              </w:rPr>
+              <w:fldChar w:fldCharType="end"/>
+            </w:r>
+          </w:sdtContent>
+        </w:sdt>
+      </w:sdtContent>
+    </w:sdt>
+  </w:p>
+  <w:p>
+    <w:pPr>
+      <w:pStyle w:val="Footer"/>
+      <w:tabs>
+        <w:tab w:val="clear" w:pos="4680"/>
+        <w:tab w:val="clear" w:pos="9360"/>
+        <w:tab w:val="right" w:pos="10670"/>
+      </w:tabs>
+    </w:pPr>
   </w:p>
 </w:ftr>
 </file>
@@ -7606,6 +8257,54 @@
       <w:szCs w:val="26"/>
     </w:rPr>
   </w:style>
+  <w:style w:type="paragraph" w:styleId="Header">
+    <w:name w:val="header"/>
+    <w:basedOn w:val="Normal"/>
+    <w:link w:val="HeaderChar"/>
+    <w:uiPriority w:val="99"/>
+    <w:unhideWhenUsed/>
+    <w:rsid w:val="009124F5"/>
+    <w:pPr>
+      <w:tabs>
+        <w:tab w:val="center" w:pos="4680"/>
+        <w:tab w:val="right" w:pos="9360"/>
+      </w:tabs>
+    </w:pPr>
+  </w:style>
+  <w:style w:type="character" w:customStyle="1" w:styleId="HeaderChar">
+    <w:name w:val="Header Char"/>
+    <w:basedOn w:val="DefaultParagraphFont"/>
+    <w:link w:val="Header"/>
+    <w:uiPriority w:val="99"/>
+    <w:rsid w:val="009124F5"/>
+    <w:rPr>
+      <w:rFonts w:ascii="Palatino Linotype" w:eastAsia="Palatino Linotype" w:hAnsi="Palatino Linotype" w:cs="Palatino Linotype"/>
+    </w:rPr>
+  </w:style>
+  <w:style w:type="paragraph" w:styleId="Footer">
+    <w:name w:val="footer"/>
+    <w:basedOn w:val="Normal"/>
+    <w:link w:val="FooterChar"/>
+    <w:uiPriority w:val="99"/>
+    <w:unhideWhenUsed/>
+    <w:rsid w:val="009124F5"/>
+    <w:pPr>
+      <w:tabs>
+        <w:tab w:val="center" w:pos="4680"/>
+        <w:tab w:val="right" w:pos="9360"/>
+      </w:tabs>
+    </w:pPr>
+  </w:style>
+  <w:style w:type="character" w:customStyle="1" w:styleId="FooterChar">
+    <w:name w:val="Footer Char"/>
+    <w:basedOn w:val="DefaultParagraphFont"/>
+    <w:link w:val="Footer"/>
+    <w:uiPriority w:val="99"/>
+    <w:rsid w:val="009124F5"/>
+    <w:rPr>
+      <w:rFonts w:ascii="Palatino Linotype" w:eastAsia="Palatino Linotype" w:hAnsi="Palatino Linotype" w:cs="Palatino Linotype"/>
+    </w:rPr>
+  </w:style>
 </w:styles>
 </file>
 

</xml_diff>

<commit_message>
chore: sync 2026-05-14 19:09:34 UTC
</commit_message>
<xml_diff>
--- a/resumes/IT_Networking_resume.docx
+++ b/resumes/IT_Networking_resume.docx
@@ -59,10 +59,13 @@
             <w:sz w:val="20"/>
             <w:szCs w:val="20"/>
           </w:rPr>
-          <w:t>capture456@outlook.com</w:t>
+          <w:t>compute456@outlook.com</w:t>
         </w:r>
       </w:hyperlink>
       <w:r>
+        <w:t xml:space="preserve"> </w:t>
+      </w:r>
+      <w:r>
         <w:rPr>
           <w:rFonts w:ascii="Aptos Display" w:hAnsi="Aptos Display"/>
           <w:bCs/>
@@ -70,7 +73,50 @@
           <w:sz w:val="20"/>
           <w:szCs w:val="20"/>
         </w:rPr>
-        <w:t xml:space="preserve"> • +1 562-833-4552</w:t>
+        <w:t>•</w:t>
+      </w:r>
+      <w:r>
+        <w:rPr>
+          <w:rFonts w:ascii="Aptos Display" w:hAnsi="Aptos Display"/>
+          <w:bCs/>
+          <w:w w:val="105"/>
+          <w:sz w:val="20"/>
+          <w:szCs w:val="20"/>
+        </w:rPr>
+        <w:t xml:space="preserve"> </w:t>
+      </w:r>
+      <w:hyperlink r:id="rId9" w:history="1">
+        <w:r>
+          <w:rPr>
+            <w:rStyle w:val="Hyperlink"/>
+            <w:rFonts w:ascii="Aptos Display" w:hAnsi="Aptos Display"/>
+            <w:bCs/>
+            <w:w w:val="105"/>
+            <w:sz w:val="20"/>
+            <w:szCs w:val="20"/>
+          </w:rPr>
+          <w:t>https://david.simplifai.team</w:t>
+        </w:r>
+      </w:hyperlink>
+      <w:r>
+        <w:rPr>
+          <w:rFonts w:ascii="Aptos Display" w:hAnsi="Aptos Display"/>
+          <w:bCs/>
+          <w:w w:val="105"/>
+          <w:sz w:val="20"/>
+          <w:szCs w:val="20"/>
+        </w:rPr>
+        <w:t xml:space="preserve"> </w:t>
+      </w:r>
+      <w:r>
+        <w:rPr>
+          <w:rFonts w:ascii="Aptos Display" w:hAnsi="Aptos Display"/>
+          <w:bCs/>
+          <w:w w:val="105"/>
+          <w:sz w:val="20"/>
+          <w:szCs w:val="20"/>
+        </w:rPr>
+        <w:t>• +1 562-833-4552</w:t>
       </w:r>
     </w:p>
     <w:p>
@@ -131,7 +177,49 @@
           <w:sz w:val="24"/>
           <w:szCs w:val="24"/>
         </w:rPr>
-        <w:t xml:space="preserve">IT and systems professional with 20+ years of experience supporting enterprise applications, </w:t>
+        <w:t xml:space="preserve">IT and systems </w:t>
+      </w:r>
+      <w:proofErr w:type="gramStart"/>
+      <w:r>
+        <w:rPr>
+          <w:rFonts w:ascii="Aptos Display" w:hAnsi="Aptos Display" w:cs="Times New Roman"/>
+          <w:bCs/>
+          <w:w w:val="105"/>
+          <w:sz w:val="24"/>
+          <w:szCs w:val="24"/>
+        </w:rPr>
+        <w:t>professional</w:t>
+      </w:r>
+      <w:proofErr w:type="gramEnd"/>
+      <w:r>
+        <w:rPr>
+          <w:rFonts w:ascii="Aptos Display" w:hAnsi="Aptos Display" w:cs="Times New Roman"/>
+          <w:bCs/>
+          <w:w w:val="105"/>
+          <w:sz w:val="24"/>
+          <w:szCs w:val="24"/>
+        </w:rPr>
+        <w:t xml:space="preserve"> with 2</w:t>
+      </w:r>
+      <w:r>
+        <w:rPr>
+          <w:rFonts w:ascii="Aptos Display" w:hAnsi="Aptos Display" w:cs="Times New Roman"/>
+          <w:bCs/>
+          <w:w w:val="105"/>
+          <w:sz w:val="24"/>
+          <w:szCs w:val="24"/>
+        </w:rPr>
+        <w:t>5</w:t>
+      </w:r>
+      <w:r>
+        <w:rPr>
+          <w:rFonts w:ascii="Aptos Display" w:hAnsi="Aptos Display" w:cs="Times New Roman"/>
+          <w:bCs/>
+          <w:w w:val="105"/>
+          <w:sz w:val="24"/>
+          <w:szCs w:val="24"/>
+        </w:rPr>
+        <w:t xml:space="preserve">+ years of experience supporting enterprise applications, </w:t>
       </w:r>
       <w:r>
         <w:rPr>
@@ -2945,7 +3033,7 @@
       </w:pPr>
     </w:p>
     <w:sectPr>
-      <w:footerReference w:type="default" r:id="rId9"/>
+      <w:footerReference w:type="default" r:id="rId10"/>
       <w:type w:val="continuous"/>
       <w:pgSz w:w="12240" w:h="15840"/>
       <w:pgMar w:top="980" w:right="720" w:bottom="700" w:left="720" w:header="0" w:footer="507" w:gutter="0"/>
@@ -2994,76 +3082,119 @@
   </w:p>
   <w:p>
     <w:pPr>
-      <w:pStyle w:val="Footer"/>
       <w:tabs>
-        <w:tab w:val="clear" w:pos="4680"/>
-        <w:tab w:val="clear" w:pos="9360"/>
-        <w:tab w:val="right" w:pos="10780"/>
+        <w:tab w:val="right" w:pos="10800"/>
       </w:tabs>
+      <w:spacing w:before="106"/>
+      <w:ind w:left="360"/>
       <w:rPr>
         <w:rFonts w:ascii="Aptos Display" w:hAnsi="Aptos Display"/>
+        <w:bCs/>
+        <w:w w:val="105"/>
+        <w:sz w:val="20"/>
+        <w:szCs w:val="20"/>
       </w:rPr>
     </w:pPr>
     <w:r>
       <w:rPr>
         <w:rFonts w:ascii="Aptos Display" w:hAnsi="Aptos Display"/>
-      </w:rPr>
-      <w:t>David Omer •</w:t>
-    </w:r>
-    <w:r>
-      <w:rPr>
-        <w:rFonts w:ascii="Aptos Display" w:hAnsi="Aptos Display"/>
-        <w:spacing w:val="46"/>
-      </w:rPr>
-      <w:t xml:space="preserve"> </w:t>
+        <w:bCs/>
+        <w:w w:val="105"/>
+        <w:sz w:val="20"/>
+        <w:szCs w:val="20"/>
+      </w:rPr>
+      <w:t xml:space="preserve">Long Beach, CA • </w:t>
     </w:r>
     <w:hyperlink r:id="rId1" w:history="1">
       <w:r>
         <w:rPr>
           <w:rStyle w:val="Hyperlink"/>
           <w:rFonts w:ascii="Aptos Display" w:hAnsi="Aptos Display"/>
-        </w:rPr>
-        <w:t>capture456@outlook.com</w:t>
+          <w:bCs/>
+          <w:w w:val="105"/>
+          <w:sz w:val="20"/>
+          <w:szCs w:val="20"/>
+        </w:rPr>
+        <w:t>c</w:t>
+      </w:r>
+      <w:r>
+        <w:rPr>
+          <w:rStyle w:val="Hyperlink"/>
+          <w:rFonts w:ascii="Aptos Display" w:hAnsi="Aptos Display"/>
+          <w:bCs/>
+          <w:w w:val="105"/>
+          <w:sz w:val="20"/>
+          <w:szCs w:val="20"/>
+        </w:rPr>
+        <w:t>ompute</w:t>
+      </w:r>
+      <w:r>
+        <w:rPr>
+          <w:rStyle w:val="Hyperlink"/>
+          <w:rFonts w:ascii="Aptos Display" w:hAnsi="Aptos Display"/>
+          <w:bCs/>
+          <w:w w:val="105"/>
+          <w:sz w:val="20"/>
+          <w:szCs w:val="20"/>
+        </w:rPr>
+        <w:t>456@outlook.com</w:t>
       </w:r>
     </w:hyperlink>
     <w:r>
-      <w:rPr>
-        <w:rFonts w:ascii="Aptos Display" w:hAnsi="Aptos Display"/>
-        <w:spacing w:val="47"/>
-      </w:rPr>
       <w:t xml:space="preserve"> </w:t>
     </w:r>
     <w:r>
       <w:rPr>
         <w:rFonts w:ascii="Aptos Display" w:hAnsi="Aptos Display"/>
+        <w:bCs/>
+        <w:w w:val="105"/>
+        <w:sz w:val="20"/>
+        <w:szCs w:val="20"/>
       </w:rPr>
       <w:t>•</w:t>
     </w:r>
     <w:r>
       <w:rPr>
         <w:rFonts w:ascii="Aptos Display" w:hAnsi="Aptos Display"/>
-        <w:spacing w:val="46"/>
+        <w:bCs/>
+        <w:w w:val="105"/>
+        <w:sz w:val="20"/>
+        <w:szCs w:val="20"/>
+      </w:rPr>
+      <w:t xml:space="preserve"> </w:t>
+    </w:r>
+    <w:hyperlink r:id="rId2" w:history="1">
+      <w:r>
+        <w:rPr>
+          <w:rStyle w:val="Hyperlink"/>
+          <w:rFonts w:ascii="Aptos Display" w:hAnsi="Aptos Display"/>
+          <w:bCs/>
+          <w:w w:val="105"/>
+          <w:sz w:val="20"/>
+          <w:szCs w:val="20"/>
+        </w:rPr>
+        <w:t>https://david.simplifai.team</w:t>
+      </w:r>
+    </w:hyperlink>
+    <w:r>
+      <w:rPr>
+        <w:rFonts w:ascii="Aptos Display" w:hAnsi="Aptos Display"/>
+        <w:bCs/>
+        <w:w w:val="105"/>
+        <w:sz w:val="20"/>
+        <w:szCs w:val="20"/>
       </w:rPr>
       <w:t xml:space="preserve"> </w:t>
     </w:r>
     <w:r>
       <w:rPr>
         <w:rFonts w:ascii="Aptos Display" w:hAnsi="Aptos Display"/>
-      </w:rPr>
-      <w:t>+1</w:t>
-    </w:r>
-    <w:r>
-      <w:rPr>
-        <w:rFonts w:ascii="Aptos Display" w:hAnsi="Aptos Display"/>
-        <w:spacing w:val="-3"/>
-      </w:rPr>
-      <w:t xml:space="preserve"> </w:t>
-    </w:r>
-    <w:r>
-      <w:rPr>
-        <w:rFonts w:ascii="Aptos Display" w:hAnsi="Aptos Display"/>
-      </w:rPr>
-      <w:t>562-833-4552</w:t>
+        <w:bCs/>
+        <w:w w:val="105"/>
+        <w:sz w:val="20"/>
+        <w:szCs w:val="20"/>
+      </w:rPr>
+      <w:t>• +1 562-833-4552</w:t>
     </w:r>
     <w:r>
       <w:rPr>
@@ -3082,6 +3213,7 @@
           <w:docPartUnique/>
         </w:docPartObj>
       </w:sdtPr>
+      <w:sdtEndPr/>
       <w:sdtContent>
         <w:sdt>
           <w:sdtPr>
@@ -3094,6 +3226,7 @@
               <w:docPartUnique/>
             </w:docPartObj>
           </w:sdtPr>
+          <w:sdtEndPr/>
           <w:sdtContent>
             <w:r>
               <w:rPr>

</xml_diff>